<commit_message>
docs: sync updated Word documents to repository
</commit_message>
<xml_diff>
--- a/Student_Task_Manager_DevOps_Assignment_Report.docx
+++ b/Student_Task_Manager_DevOps_Assignment_Report.docx
@@ -115,7 +115,7 @@
                 <w:color w:val="1F2937"/>
                 <w:sz w:val="19"/>
               </w:rPr>
-              <w:t>Muhammad Shahzaib / Noor Akhtar</w:t>
+              <w:t>Noor Akhtar</w:t>
             </w:r>
           </w:p>
         </w:tc>
@@ -370,7 +370,7 @@
                 <w:color w:val="1F2937"/>
                 <w:sz w:val="19"/>
               </w:rPr>
-              <w:t>https://github.com/MuhammadShahzaib7/student-task-manager.git</w:t>
+              <w:t>https://github.com/Noor1675/student-task-manager.git</w:t>
             </w:r>
           </w:p>
         </w:tc>
@@ -587,61 +587,6 @@
         <w:spacing w:after="80"/>
       </w:pPr>
     </w:p>
-    <w:p>
-      <w:pPr>
-        <w:spacing w:before="120" w:after="80"/>
-        <w:jc w:val="center"/>
-      </w:pPr>
-      <w:r>
-        <w:drawing>
-          <wp:inline xmlns:a="http://schemas.openxmlformats.org/drawingml/2006/main" xmlns:pic="http://schemas.openxmlformats.org/drawingml/2006/picture">
-            <wp:extent cx="5669280" cy="894486"/>
-            <wp:docPr id="1" name="Picture 1"/>
-            <wp:cNvGraphicFramePr>
-              <a:graphicFrameLocks noChangeAspect="1"/>
-            </wp:cNvGraphicFramePr>
-            <a:graphic>
-              <a:graphicData uri="http://schemas.openxmlformats.org/drawingml/2006/picture">
-                <pic:pic>
-                  <pic:nvPicPr>
-                    <pic:cNvPr id="0" name="screenshot_1_1_git_version.png"/>
-                    <pic:cNvPicPr/>
-                  </pic:nvPicPr>
-                  <pic:blipFill>
-                    <a:blip r:embed="rId9"/>
-                    <a:stretch>
-                      <a:fillRect/>
-                    </a:stretch>
-                  </pic:blipFill>
-                  <pic:spPr>
-                    <a:xfrm>
-                      <a:off x="0" y="0"/>
-                      <a:ext cx="5669280" cy="894486"/>
-                    </a:xfrm>
-                    <a:prstGeom prst="rect"/>
-                  </pic:spPr>
-                </pic:pic>
-              </a:graphicData>
-            </a:graphic>
-          </wp:inline>
-        </w:drawing>
-      </w:r>
-    </w:p>
-    <w:p>
-      <w:pPr>
-        <w:spacing w:before="40" w:after="120"/>
-        <w:jc w:val="center"/>
-      </w:pPr>
-      <w:r>
-        <w:rPr>
-          <w:rFonts w:ascii="Segoe UI" w:hAnsi="Segoe UI"/>
-          <w:i/>
-          <w:color w:val="6B7280"/>
-          <w:sz w:val="18"/>
-        </w:rPr>
-        <w:t>Figure: Figure 1.1 — Git Version Verification in Windows Command Prompt</w:t>
-      </w:r>
-    </w:p>
     <w:tbl>
       <w:tblPr>
         <w:tblW w:type="auto" w:w="0"/>
@@ -655,32 +600,78 @@
         <w:tc>
           <w:tcPr>
             <w:tcW w:type="dxa" w:w="9648"/>
-            <w:shd w:fill="F9FAFB"/>
+            <w:shd w:fill="F8FAFC"/>
             <w:tcMar>
-              <w:top w:w="100" w:type="dxa"/>
-              <w:bottom w:w="100" w:type="dxa"/>
-              <w:left w:w="150" w:type="dxa"/>
-              <w:right w:w="150" w:type="dxa"/>
+              <w:top w:w="140" w:type="dxa"/>
+              <w:bottom w:w="140" w:type="dxa"/>
+              <w:left w:w="180" w:type="dxa"/>
+              <w:right w:w="180" w:type="dxa"/>
             </w:tcMar>
+            <w:tcBorders>
+              <w:top w:val="dashed" w:sz="16" w:space="0" w:color="94A3B8"/>
+              <w:left w:val="dashed" w:sz="16" w:space="0" w:color="94A3B8"/>
+              <w:bottom w:val="dashed" w:sz="16" w:space="0" w:color="94A3B8"/>
+              <w:right w:val="dashed" w:sz="16" w:space="0" w:color="94A3B8"/>
+            </w:tcBorders>
           </w:tcPr>
           <w:p>
             <w:pPr>
-              <w:spacing w:before="40" w:after="40"/>
+              <w:spacing w:before="120" w:after="40"/>
+              <w:jc w:val="center"/>
             </w:pPr>
             <w:r>
               <w:rPr>
+                <w:rFonts w:ascii="Segoe UI" w:hAnsi="Segoe UI"/>
                 <w:b/>
-                <w:color w:val="10B981"/>
-                <w:sz w:val="18"/>
+                <w:color w:val="1E3A8A"/>
+                <w:sz w:val="22"/>
               </w:rPr>
-              <w:t xml:space="preserve">📸 How to take this screenshot yourself: </w:t>
+              <w:t>📸 [SCREENSHOT PLACEHOLDER]</w:t>
+              <w:br/>
             </w:r>
             <w:r>
               <w:rPr>
+                <w:rFonts w:ascii="Segoe UI" w:hAnsi="Segoe UI"/>
+                <w:b/>
+                <w:color w:val="475569"/>
+                <w:sz w:val="19"/>
+              </w:rPr>
+              <w:t>Figure: Figure 1.1 — Git Version Verification in Windows Command Prompt</w:t>
+              <w:br/>
+            </w:r>
+          </w:p>
+          <w:p>
+            <w:pPr>
+              <w:spacing w:before="80" w:after="80"/>
+              <w:jc w:val="left"/>
+            </w:pPr>
+            <w:r>
+              <w:rPr>
+                <w:rFonts w:ascii="Segoe UI" w:hAnsi="Segoe UI"/>
+                <w:b/>
+                <w:color w:val="0D9488"/>
+                <w:sz w:val="18"/>
+              </w:rPr>
+              <w:t>👉 Asli Screenshot Lene Ka Tareeqa:</w:t>
+              <w:br/>
+            </w:r>
+            <w:r>
+              <w:rPr>
+                <w:rFonts w:ascii="Segoe UI" w:hAnsi="Segoe UI"/>
                 <w:color w:val="1F2937"/>
                 <w:sz w:val="17"/>
               </w:rPr>
               <w:t>Open Command Prompt (Win + R -&gt; cmd), type 'git --version' and press Enter. Press Win + Shift + S to capture the window.</w:t>
+              <w:br/>
+            </w:r>
+            <w:r>
+              <w:rPr>
+                <w:rFonts w:ascii="Segoe UI" w:hAnsi="Segoe UI"/>
+                <w:i/>
+                <w:color w:val="64748B"/>
+                <w:sz w:val="17"/>
+              </w:rPr>
+              <w:t>📋 Paste karne ke liye: Win + Shift + S dabakar snip karein -&gt; Word mein yahan click karke Ctrl + V dabayein</w:t>
             </w:r>
           </w:p>
         </w:tc>
@@ -688,7 +679,7 @@
     </w:tbl>
     <w:p>
       <w:pPr>
-        <w:spacing w:after="120"/>
+        <w:spacing w:after="160"/>
       </w:pPr>
     </w:p>
     <w:p>
@@ -757,61 +748,6 @@
         <w:spacing w:after="80"/>
       </w:pPr>
     </w:p>
-    <w:p>
-      <w:pPr>
-        <w:spacing w:before="120" w:after="80"/>
-        <w:jc w:val="center"/>
-      </w:pPr>
-      <w:r>
-        <w:drawing>
-          <wp:inline xmlns:a="http://schemas.openxmlformats.org/drawingml/2006/main" xmlns:pic="http://schemas.openxmlformats.org/drawingml/2006/picture">
-            <wp:extent cx="5669280" cy="2878734"/>
-            <wp:docPr id="2" name="Picture 2"/>
-            <wp:cNvGraphicFramePr>
-              <a:graphicFrameLocks noChangeAspect="1"/>
-            </wp:cNvGraphicFramePr>
-            <a:graphic>
-              <a:graphicData uri="http://schemas.openxmlformats.org/drawingml/2006/picture">
-                <pic:pic>
-                  <pic:nvPicPr>
-                    <pic:cNvPr id="0" name="screenshot_1_2_gitignore.png"/>
-                    <pic:cNvPicPr/>
-                  </pic:nvPicPr>
-                  <pic:blipFill>
-                    <a:blip r:embed="rId10"/>
-                    <a:stretch>
-                      <a:fillRect/>
-                    </a:stretch>
-                  </pic:blipFill>
-                  <pic:spPr>
-                    <a:xfrm>
-                      <a:off x="0" y="0"/>
-                      <a:ext cx="5669280" cy="2878734"/>
-                    </a:xfrm>
-                    <a:prstGeom prst="rect"/>
-                  </pic:spPr>
-                </pic:pic>
-              </a:graphicData>
-            </a:graphic>
-          </wp:inline>
-        </w:drawing>
-      </w:r>
-    </w:p>
-    <w:p>
-      <w:pPr>
-        <w:spacing w:before="40" w:after="120"/>
-        <w:jc w:val="center"/>
-      </w:pPr>
-      <w:r>
-        <w:rPr>
-          <w:rFonts w:ascii="Segoe UI" w:hAnsi="Segoe UI"/>
-          <w:i/>
-          <w:color w:val="6B7280"/>
-          <w:sz w:val="18"/>
-        </w:rPr>
-        <w:t>Figure: Figure 1.2 — .gitignore Inspection and Root Directory File Listing</w:t>
-      </w:r>
-    </w:p>
     <w:tbl>
       <w:tblPr>
         <w:tblW w:type="auto" w:w="0"/>
@@ -825,32 +761,78 @@
         <w:tc>
           <w:tcPr>
             <w:tcW w:type="dxa" w:w="9648"/>
-            <w:shd w:fill="F9FAFB"/>
+            <w:shd w:fill="F8FAFC"/>
             <w:tcMar>
-              <w:top w:w="100" w:type="dxa"/>
-              <w:bottom w:w="100" w:type="dxa"/>
-              <w:left w:w="150" w:type="dxa"/>
-              <w:right w:w="150" w:type="dxa"/>
+              <w:top w:w="140" w:type="dxa"/>
+              <w:bottom w:w="140" w:type="dxa"/>
+              <w:left w:w="180" w:type="dxa"/>
+              <w:right w:w="180" w:type="dxa"/>
             </w:tcMar>
+            <w:tcBorders>
+              <w:top w:val="dashed" w:sz="16" w:space="0" w:color="94A3B8"/>
+              <w:left w:val="dashed" w:sz="16" w:space="0" w:color="94A3B8"/>
+              <w:bottom w:val="dashed" w:sz="16" w:space="0" w:color="94A3B8"/>
+              <w:right w:val="dashed" w:sz="16" w:space="0" w:color="94A3B8"/>
+            </w:tcBorders>
           </w:tcPr>
           <w:p>
             <w:pPr>
-              <w:spacing w:before="40" w:after="40"/>
+              <w:spacing w:before="120" w:after="40"/>
+              <w:jc w:val="center"/>
             </w:pPr>
             <w:r>
               <w:rPr>
+                <w:rFonts w:ascii="Segoe UI" w:hAnsi="Segoe UI"/>
                 <w:b/>
-                <w:color w:val="10B981"/>
-                <w:sz w:val="18"/>
+                <w:color w:val="1E3A8A"/>
+                <w:sz w:val="22"/>
               </w:rPr>
-              <w:t xml:space="preserve">📸 How to take this screenshot yourself: </w:t>
+              <w:t>📸 [SCREENSHOT PLACEHOLDER]</w:t>
+              <w:br/>
             </w:r>
             <w:r>
               <w:rPr>
+                <w:rFonts w:ascii="Segoe UI" w:hAnsi="Segoe UI"/>
+                <w:b/>
+                <w:color w:val="475569"/>
+                <w:sz w:val="19"/>
+              </w:rPr>
+              <w:t>Figure: Figure 1.2 — .gitignore Inspection and Root Directory File Listing</w:t>
+              <w:br/>
+            </w:r>
+          </w:p>
+          <w:p>
+            <w:pPr>
+              <w:spacing w:before="80" w:after="80"/>
+              <w:jc w:val="left"/>
+            </w:pPr>
+            <w:r>
+              <w:rPr>
+                <w:rFonts w:ascii="Segoe UI" w:hAnsi="Segoe UI"/>
+                <w:b/>
+                <w:color w:val="0D9488"/>
+                <w:sz w:val="18"/>
+              </w:rPr>
+              <w:t>👉 Asli Screenshot Lene Ka Tareeqa:</w:t>
+              <w:br/>
+            </w:r>
+            <w:r>
+              <w:rPr>
+                <w:rFonts w:ascii="Segoe UI" w:hAnsi="Segoe UI"/>
                 <w:color w:val="1F2937"/>
                 <w:sz w:val="17"/>
               </w:rPr>
               <w:t>In Command Prompt, run 'type .gitignore' followed by 'dir /b' to display files. Capture with Win + Shift + S.</w:t>
+              <w:br/>
+            </w:r>
+            <w:r>
+              <w:rPr>
+                <w:rFonts w:ascii="Segoe UI" w:hAnsi="Segoe UI"/>
+                <w:i/>
+                <w:color w:val="64748B"/>
+                <w:sz w:val="17"/>
+              </w:rPr>
+              <w:t>📋 Paste karne ke liye: Win + Shift + S dabakar snip karein -&gt; Word mein yahan click karke Ctrl + V dabayein</w:t>
             </w:r>
           </w:p>
         </w:tc>
@@ -858,7 +840,7 @@
     </w:tbl>
     <w:p>
       <w:pPr>
-        <w:spacing w:after="120"/>
+        <w:spacing w:after="160"/>
       </w:pPr>
     </w:p>
     <w:p>
@@ -936,61 +918,6 @@
         <w:spacing w:after="80"/>
       </w:pPr>
     </w:p>
-    <w:p>
-      <w:pPr>
-        <w:spacing w:before="120" w:after="80"/>
-        <w:jc w:val="center"/>
-      </w:pPr>
-      <w:r>
-        <w:drawing>
-          <wp:inline xmlns:a="http://schemas.openxmlformats.org/drawingml/2006/main" xmlns:pic="http://schemas.openxmlformats.org/drawingml/2006/picture">
-            <wp:extent cx="5669280" cy="1952752"/>
-            <wp:docPr id="3" name="Picture 3"/>
-            <wp:cNvGraphicFramePr>
-              <a:graphicFrameLocks noChangeAspect="1"/>
-            </wp:cNvGraphicFramePr>
-            <a:graphic>
-              <a:graphicData uri="http://schemas.openxmlformats.org/drawingml/2006/picture">
-                <pic:pic>
-                  <pic:nvPicPr>
-                    <pic:cNvPr id="0" name="screenshot_1_3_git_commits.png"/>
-                    <pic:cNvPicPr/>
-                  </pic:nvPicPr>
-                  <pic:blipFill>
-                    <a:blip r:embed="rId11"/>
-                    <a:stretch>
-                      <a:fillRect/>
-                    </a:stretch>
-                  </pic:blipFill>
-                  <pic:spPr>
-                    <a:xfrm>
-                      <a:off x="0" y="0"/>
-                      <a:ext cx="5669280" cy="1952752"/>
-                    </a:xfrm>
-                    <a:prstGeom prst="rect"/>
-                  </pic:spPr>
-                </pic:pic>
-              </a:graphicData>
-            </a:graphic>
-          </wp:inline>
-        </w:drawing>
-      </w:r>
-    </w:p>
-    <w:p>
-      <w:pPr>
-        <w:spacing w:before="40" w:after="120"/>
-        <w:jc w:val="center"/>
-      </w:pPr>
-      <w:r>
-        <w:rPr>
-          <w:rFonts w:ascii="Segoe UI" w:hAnsi="Segoe UI"/>
-          <w:i/>
-          <w:color w:val="6B7280"/>
-          <w:sz w:val="18"/>
-        </w:rPr>
-        <w:t>Figure: Figure 1.3 — Git Working Tree Status and Commit History Log</w:t>
-      </w:r>
-    </w:p>
     <w:tbl>
       <w:tblPr>
         <w:tblW w:type="auto" w:w="0"/>
@@ -1004,32 +931,78 @@
         <w:tc>
           <w:tcPr>
             <w:tcW w:type="dxa" w:w="9648"/>
-            <w:shd w:fill="F9FAFB"/>
+            <w:shd w:fill="F8FAFC"/>
             <w:tcMar>
-              <w:top w:w="100" w:type="dxa"/>
-              <w:bottom w:w="100" w:type="dxa"/>
-              <w:left w:w="150" w:type="dxa"/>
-              <w:right w:w="150" w:type="dxa"/>
+              <w:top w:w="140" w:type="dxa"/>
+              <w:bottom w:w="140" w:type="dxa"/>
+              <w:left w:w="180" w:type="dxa"/>
+              <w:right w:w="180" w:type="dxa"/>
             </w:tcMar>
+            <w:tcBorders>
+              <w:top w:val="dashed" w:sz="16" w:space="0" w:color="94A3B8"/>
+              <w:left w:val="dashed" w:sz="16" w:space="0" w:color="94A3B8"/>
+              <w:bottom w:val="dashed" w:sz="16" w:space="0" w:color="94A3B8"/>
+              <w:right w:val="dashed" w:sz="16" w:space="0" w:color="94A3B8"/>
+            </w:tcBorders>
           </w:tcPr>
           <w:p>
             <w:pPr>
-              <w:spacing w:before="40" w:after="40"/>
+              <w:spacing w:before="120" w:after="40"/>
+              <w:jc w:val="center"/>
             </w:pPr>
             <w:r>
               <w:rPr>
+                <w:rFonts w:ascii="Segoe UI" w:hAnsi="Segoe UI"/>
                 <w:b/>
-                <w:color w:val="10B981"/>
-                <w:sz w:val="18"/>
+                <w:color w:val="1E3A8A"/>
+                <w:sz w:val="22"/>
               </w:rPr>
-              <w:t xml:space="preserve">📸 How to take this screenshot yourself: </w:t>
+              <w:t>📸 [SCREENSHOT PLACEHOLDER]</w:t>
+              <w:br/>
             </w:r>
             <w:r>
               <w:rPr>
+                <w:rFonts w:ascii="Segoe UI" w:hAnsi="Segoe UI"/>
+                <w:b/>
+                <w:color w:val="475569"/>
+                <w:sz w:val="19"/>
+              </w:rPr>
+              <w:t>Figure: Figure 1.3 — Git Working Tree Status and Commit History Log</w:t>
+              <w:br/>
+            </w:r>
+          </w:p>
+          <w:p>
+            <w:pPr>
+              <w:spacing w:before="80" w:after="80"/>
+              <w:jc w:val="left"/>
+            </w:pPr>
+            <w:r>
+              <w:rPr>
+                <w:rFonts w:ascii="Segoe UI" w:hAnsi="Segoe UI"/>
+                <w:b/>
+                <w:color w:val="0D9488"/>
+                <w:sz w:val="18"/>
+              </w:rPr>
+              <w:t>👉 Asli Screenshot Lene Ka Tareeqa:</w:t>
+              <w:br/>
+            </w:r>
+            <w:r>
+              <w:rPr>
+                <w:rFonts w:ascii="Segoe UI" w:hAnsi="Segoe UI"/>
                 <w:color w:val="1F2937"/>
                 <w:sz w:val="17"/>
               </w:rPr>
               <w:t>Run 'git status' and 'git log --oneline -n 5' in Command Prompt. Capture the clean tree and commit hashes.</w:t>
+              <w:br/>
+            </w:r>
+            <w:r>
+              <w:rPr>
+                <w:rFonts w:ascii="Segoe UI" w:hAnsi="Segoe UI"/>
+                <w:i/>
+                <w:color w:val="64748B"/>
+                <w:sz w:val="17"/>
+              </w:rPr>
+              <w:t>📋 Paste karne ke liye: Win + Shift + S dabakar snip karein -&gt; Word mein yahan click karke Ctrl + V dabayein</w:t>
             </w:r>
           </w:p>
         </w:tc>
@@ -1037,7 +1010,7 @@
     </w:tbl>
     <w:p>
       <w:pPr>
-        <w:spacing w:after="120"/>
+        <w:spacing w:after="160"/>
       </w:pPr>
     </w:p>
     <w:p>
@@ -1089,7 +1062,7 @@
                 <w:color w:val="111827"/>
                 <w:sz w:val="19"/>
               </w:rPr>
-              <w:t>git remote add origin https://github.com/MuhammadShahzaib7/student-task-manager.git</w:t>
+              <w:t>git remote set-url origin https://github.com/Noor1675/student-task-manager.git</w:t>
               <w:br/>
               <w:t>git branch -M main</w:t>
               <w:br/>
@@ -1104,61 +1077,6 @@
         <w:spacing w:after="80"/>
       </w:pPr>
     </w:p>
-    <w:p>
-      <w:pPr>
-        <w:spacing w:before="120" w:after="80"/>
-        <w:jc w:val="center"/>
-      </w:pPr>
-      <w:r>
-        <w:drawing>
-          <wp:inline xmlns:a="http://schemas.openxmlformats.org/drawingml/2006/main" xmlns:pic="http://schemas.openxmlformats.org/drawingml/2006/picture">
-            <wp:extent cx="5669280" cy="2349602"/>
-            <wp:docPr id="4" name="Picture 4"/>
-            <wp:cNvGraphicFramePr>
-              <a:graphicFrameLocks noChangeAspect="1"/>
-            </wp:cNvGraphicFramePr>
-            <a:graphic>
-              <a:graphicData uri="http://schemas.openxmlformats.org/drawingml/2006/picture">
-                <pic:pic>
-                  <pic:nvPicPr>
-                    <pic:cNvPr id="0" name="screenshot_1_4_github_repo.png"/>
-                    <pic:cNvPicPr/>
-                  </pic:nvPicPr>
-                  <pic:blipFill>
-                    <a:blip r:embed="rId12"/>
-                    <a:stretch>
-                      <a:fillRect/>
-                    </a:stretch>
-                  </pic:blipFill>
-                  <pic:spPr>
-                    <a:xfrm>
-                      <a:off x="0" y="0"/>
-                      <a:ext cx="5669280" cy="2349602"/>
-                    </a:xfrm>
-                    <a:prstGeom prst="rect"/>
-                  </pic:spPr>
-                </pic:pic>
-              </a:graphicData>
-            </a:graphic>
-          </wp:inline>
-        </w:drawing>
-      </w:r>
-    </w:p>
-    <w:p>
-      <w:pPr>
-        <w:spacing w:before="40" w:after="120"/>
-        <w:jc w:val="center"/>
-      </w:pPr>
-      <w:r>
-        <w:rPr>
-          <w:rFonts w:ascii="Segoe UI" w:hAnsi="Segoe UI"/>
-          <w:i/>
-          <w:color w:val="6B7280"/>
-          <w:sz w:val="18"/>
-        </w:rPr>
-        <w:t>Figure: Figure 1.4 — Remote Configuration and Successful GitHub Push Synchronization</w:t>
-      </w:r>
-    </w:p>
     <w:tbl>
       <w:tblPr>
         <w:tblW w:type="auto" w:w="0"/>
@@ -1172,32 +1090,78 @@
         <w:tc>
           <w:tcPr>
             <w:tcW w:type="dxa" w:w="9648"/>
-            <w:shd w:fill="F9FAFB"/>
+            <w:shd w:fill="F8FAFC"/>
             <w:tcMar>
-              <w:top w:w="100" w:type="dxa"/>
-              <w:bottom w:w="100" w:type="dxa"/>
-              <w:left w:w="150" w:type="dxa"/>
-              <w:right w:w="150" w:type="dxa"/>
+              <w:top w:w="140" w:type="dxa"/>
+              <w:bottom w:w="140" w:type="dxa"/>
+              <w:left w:w="180" w:type="dxa"/>
+              <w:right w:w="180" w:type="dxa"/>
             </w:tcMar>
+            <w:tcBorders>
+              <w:top w:val="dashed" w:sz="16" w:space="0" w:color="94A3B8"/>
+              <w:left w:val="dashed" w:sz="16" w:space="0" w:color="94A3B8"/>
+              <w:bottom w:val="dashed" w:sz="16" w:space="0" w:color="94A3B8"/>
+              <w:right w:val="dashed" w:sz="16" w:space="0" w:color="94A3B8"/>
+            </w:tcBorders>
           </w:tcPr>
           <w:p>
             <w:pPr>
-              <w:spacing w:before="40" w:after="40"/>
+              <w:spacing w:before="120" w:after="40"/>
+              <w:jc w:val="center"/>
             </w:pPr>
             <w:r>
               <w:rPr>
+                <w:rFonts w:ascii="Segoe UI" w:hAnsi="Segoe UI"/>
                 <w:b/>
-                <w:color w:val="10B981"/>
-                <w:sz w:val="18"/>
+                <w:color w:val="1E3A8A"/>
+                <w:sz w:val="22"/>
               </w:rPr>
-              <w:t xml:space="preserve">📸 How to take this screenshot yourself: </w:t>
+              <w:t>📸 [SCREENSHOT PLACEHOLDER]</w:t>
+              <w:br/>
             </w:r>
             <w:r>
               <w:rPr>
+                <w:rFonts w:ascii="Segoe UI" w:hAnsi="Segoe UI"/>
+                <w:b/>
+                <w:color w:val="475569"/>
+                <w:sz w:val="19"/>
+              </w:rPr>
+              <w:t>Figure: Figure 1.4 — Remote Configuration and Successful GitHub Push Synchronization</w:t>
+              <w:br/>
+            </w:r>
+          </w:p>
+          <w:p>
+            <w:pPr>
+              <w:spacing w:before="80" w:after="80"/>
+              <w:jc w:val="left"/>
+            </w:pPr>
+            <w:r>
+              <w:rPr>
+                <w:rFonts w:ascii="Segoe UI" w:hAnsi="Segoe UI"/>
+                <w:b/>
+                <w:color w:val="0D9488"/>
+                <w:sz w:val="18"/>
+              </w:rPr>
+              <w:t>👉 Asli Screenshot Lene Ka Tareeqa:</w:t>
+              <w:br/>
+            </w:r>
+            <w:r>
+              <w:rPr>
+                <w:rFonts w:ascii="Segoe UI" w:hAnsi="Segoe UI"/>
                 <w:color w:val="1F2937"/>
                 <w:sz w:val="17"/>
               </w:rPr>
               <w:t>Run 'git remote -v' and 'git push -u origin main' in Command Prompt or view the repo on github.com. Capture with Win + Shift + S.</w:t>
+              <w:br/>
+            </w:r>
+            <w:r>
+              <w:rPr>
+                <w:rFonts w:ascii="Segoe UI" w:hAnsi="Segoe UI"/>
+                <w:i/>
+                <w:color w:val="64748B"/>
+                <w:sz w:val="17"/>
+              </w:rPr>
+              <w:t>📋 Paste karne ke liye: Win + Shift + S dabakar snip karein -&gt; Word mein yahan click karke Ctrl + V dabayein</w:t>
             </w:r>
           </w:p>
         </w:tc>
@@ -1205,7 +1169,7 @@
     </w:tbl>
     <w:p>
       <w:pPr>
-        <w:spacing w:after="120"/>
+        <w:spacing w:after="160"/>
       </w:pPr>
     </w:p>
     <w:p>
@@ -1251,61 +1215,6 @@
         <w:t>3. In System variables, edit Path and append: %JAVA_HOME%\bin</w:t>
       </w:r>
     </w:p>
-    <w:p>
-      <w:pPr>
-        <w:spacing w:before="120" w:after="80"/>
-        <w:jc w:val="center"/>
-      </w:pPr>
-      <w:r>
-        <w:drawing>
-          <wp:inline xmlns:a="http://schemas.openxmlformats.org/drawingml/2006/main" xmlns:pic="http://schemas.openxmlformats.org/drawingml/2006/picture">
-            <wp:extent cx="5669280" cy="2581014"/>
-            <wp:docPr id="5" name="Picture 5"/>
-            <wp:cNvGraphicFramePr>
-              <a:graphicFrameLocks noChangeAspect="1"/>
-            </wp:cNvGraphicFramePr>
-            <a:graphic>
-              <a:graphicData uri="http://schemas.openxmlformats.org/drawingml/2006/picture">
-                <pic:pic>
-                  <pic:nvPicPr>
-                    <pic:cNvPr id="0" name="screenshot_2_1_java_env.png"/>
-                    <pic:cNvPicPr/>
-                  </pic:nvPicPr>
-                  <pic:blipFill>
-                    <a:blip r:embed="rId13"/>
-                    <a:stretch>
-                      <a:fillRect/>
-                    </a:stretch>
-                  </pic:blipFill>
-                  <pic:spPr>
-                    <a:xfrm>
-                      <a:off x="0" y="0"/>
-                      <a:ext cx="5669280" cy="2581014"/>
-                    </a:xfrm>
-                    <a:prstGeom prst="rect"/>
-                  </pic:spPr>
-                </pic:pic>
-              </a:graphicData>
-            </a:graphic>
-          </wp:inline>
-        </w:drawing>
-      </w:r>
-    </w:p>
-    <w:p>
-      <w:pPr>
-        <w:spacing w:before="40" w:after="120"/>
-        <w:jc w:val="center"/>
-      </w:pPr>
-      <w:r>
-        <w:rPr>
-          <w:rFonts w:ascii="Segoe UI" w:hAnsi="Segoe UI"/>
-          <w:i/>
-          <w:color w:val="6B7280"/>
-          <w:sz w:val="18"/>
-        </w:rPr>
-        <w:t>Figure: Figure 2.1 — Windows Environment Variables Dialog with JAVA_HOME and Path</w:t>
-      </w:r>
-    </w:p>
     <w:tbl>
       <w:tblPr>
         <w:tblW w:type="auto" w:w="0"/>
@@ -1319,32 +1228,78 @@
         <w:tc>
           <w:tcPr>
             <w:tcW w:type="dxa" w:w="9648"/>
-            <w:shd w:fill="F9FAFB"/>
+            <w:shd w:fill="F8FAFC"/>
             <w:tcMar>
-              <w:top w:w="100" w:type="dxa"/>
-              <w:bottom w:w="100" w:type="dxa"/>
-              <w:left w:w="150" w:type="dxa"/>
-              <w:right w:w="150" w:type="dxa"/>
+              <w:top w:w="140" w:type="dxa"/>
+              <w:bottom w:w="140" w:type="dxa"/>
+              <w:left w:w="180" w:type="dxa"/>
+              <w:right w:w="180" w:type="dxa"/>
             </w:tcMar>
+            <w:tcBorders>
+              <w:top w:val="dashed" w:sz="16" w:space="0" w:color="94A3B8"/>
+              <w:left w:val="dashed" w:sz="16" w:space="0" w:color="94A3B8"/>
+              <w:bottom w:val="dashed" w:sz="16" w:space="0" w:color="94A3B8"/>
+              <w:right w:val="dashed" w:sz="16" w:space="0" w:color="94A3B8"/>
+            </w:tcBorders>
           </w:tcPr>
           <w:p>
             <w:pPr>
-              <w:spacing w:before="40" w:after="40"/>
+              <w:spacing w:before="120" w:after="40"/>
+              <w:jc w:val="center"/>
             </w:pPr>
             <w:r>
               <w:rPr>
+                <w:rFonts w:ascii="Segoe UI" w:hAnsi="Segoe UI"/>
                 <w:b/>
-                <w:color w:val="10B981"/>
-                <w:sz w:val="18"/>
+                <w:color w:val="1E3A8A"/>
+                <w:sz w:val="22"/>
               </w:rPr>
-              <w:t xml:space="preserve">📸 How to take this screenshot yourself: </w:t>
+              <w:t>📸 [SCREENSHOT PLACEHOLDER]</w:t>
+              <w:br/>
             </w:r>
             <w:r>
               <w:rPr>
+                <w:rFonts w:ascii="Segoe UI" w:hAnsi="Segoe UI"/>
+                <w:b/>
+                <w:color w:val="475569"/>
+                <w:sz w:val="19"/>
+              </w:rPr>
+              <w:t>Figure: Figure 2.1 — Windows Environment Variables Dialog with JAVA_HOME and Path</w:t>
+              <w:br/>
+            </w:r>
+          </w:p>
+          <w:p>
+            <w:pPr>
+              <w:spacing w:before="80" w:after="80"/>
+              <w:jc w:val="left"/>
+            </w:pPr>
+            <w:r>
+              <w:rPr>
+                <w:rFonts w:ascii="Segoe UI" w:hAnsi="Segoe UI"/>
+                <w:b/>
+                <w:color w:val="0D9488"/>
+                <w:sz w:val="18"/>
+              </w:rPr>
+              <w:t>👉 Asli Screenshot Lene Ka Tareeqa:</w:t>
+              <w:br/>
+            </w:r>
+            <w:r>
+              <w:rPr>
+                <w:rFonts w:ascii="Segoe UI" w:hAnsi="Segoe UI"/>
                 <w:color w:val="1F2937"/>
                 <w:sz w:val="17"/>
               </w:rPr>
               <w:t>Press Win + S -&gt; type 'env' -&gt; Edit system environment variables -&gt; click 'Environment Variables'. Select JAVA_HOME and Path. Capture with Win + Shift + S.</w:t>
+              <w:br/>
+            </w:r>
+            <w:r>
+              <w:rPr>
+                <w:rFonts w:ascii="Segoe UI" w:hAnsi="Segoe UI"/>
+                <w:i/>
+                <w:color w:val="64748B"/>
+                <w:sz w:val="17"/>
+              </w:rPr>
+              <w:t>📋 Paste karne ke liye: Win + Shift + S dabakar snip karein -&gt; Word mein yahan click karke Ctrl + V dabayein</w:t>
             </w:r>
           </w:p>
         </w:tc>
@@ -1352,7 +1307,7 @@
     </w:tbl>
     <w:p>
       <w:pPr>
-        <w:spacing w:after="120"/>
+        <w:spacing w:after="160"/>
       </w:pPr>
     </w:p>
     <w:p>
@@ -1431,61 +1386,6 @@
         <w:spacing w:after="80"/>
       </w:pPr>
     </w:p>
-    <w:p>
-      <w:pPr>
-        <w:spacing w:before="120" w:after="80"/>
-        <w:jc w:val="center"/>
-      </w:pPr>
-      <w:r>
-        <w:drawing>
-          <wp:inline xmlns:a="http://schemas.openxmlformats.org/drawingml/2006/main" xmlns:pic="http://schemas.openxmlformats.org/drawingml/2006/picture">
-            <wp:extent cx="5669280" cy="1952752"/>
-            <wp:docPr id="6" name="Picture 6"/>
-            <wp:cNvGraphicFramePr>
-              <a:graphicFrameLocks noChangeAspect="1"/>
-            </wp:cNvGraphicFramePr>
-            <a:graphic>
-              <a:graphicData uri="http://schemas.openxmlformats.org/drawingml/2006/picture">
-                <pic:pic>
-                  <pic:nvPicPr>
-                    <pic:cNvPr id="0" name="screenshot_2_2_java_verify.png"/>
-                    <pic:cNvPicPr/>
-                  </pic:nvPicPr>
-                  <pic:blipFill>
-                    <a:blip r:embed="rId14"/>
-                    <a:stretch>
-                      <a:fillRect/>
-                    </a:stretch>
-                  </pic:blipFill>
-                  <pic:spPr>
-                    <a:xfrm>
-                      <a:off x="0" y="0"/>
-                      <a:ext cx="5669280" cy="1952752"/>
-                    </a:xfrm>
-                    <a:prstGeom prst="rect"/>
-                  </pic:spPr>
-                </pic:pic>
-              </a:graphicData>
-            </a:graphic>
-          </wp:inline>
-        </w:drawing>
-      </w:r>
-    </w:p>
-    <w:p>
-      <w:pPr>
-        <w:spacing w:before="40" w:after="120"/>
-        <w:jc w:val="center"/>
-      </w:pPr>
-      <w:r>
-        <w:rPr>
-          <w:rFonts w:ascii="Segoe UI" w:hAnsi="Segoe UI"/>
-          <w:i/>
-          <w:color w:val="6B7280"/>
-          <w:sz w:val="18"/>
-        </w:rPr>
-        <w:t>Figure: Figure 2.2 — Verification of java, javac and JAVA_HOME in Command Prompt</w:t>
-      </w:r>
-    </w:p>
     <w:tbl>
       <w:tblPr>
         <w:tblW w:type="auto" w:w="0"/>
@@ -1499,32 +1399,78 @@
         <w:tc>
           <w:tcPr>
             <w:tcW w:type="dxa" w:w="9648"/>
-            <w:shd w:fill="F9FAFB"/>
+            <w:shd w:fill="F8FAFC"/>
             <w:tcMar>
-              <w:top w:w="100" w:type="dxa"/>
-              <w:bottom w:w="100" w:type="dxa"/>
-              <w:left w:w="150" w:type="dxa"/>
-              <w:right w:w="150" w:type="dxa"/>
+              <w:top w:w="140" w:type="dxa"/>
+              <w:bottom w:w="140" w:type="dxa"/>
+              <w:left w:w="180" w:type="dxa"/>
+              <w:right w:w="180" w:type="dxa"/>
             </w:tcMar>
+            <w:tcBorders>
+              <w:top w:val="dashed" w:sz="16" w:space="0" w:color="94A3B8"/>
+              <w:left w:val="dashed" w:sz="16" w:space="0" w:color="94A3B8"/>
+              <w:bottom w:val="dashed" w:sz="16" w:space="0" w:color="94A3B8"/>
+              <w:right w:val="dashed" w:sz="16" w:space="0" w:color="94A3B8"/>
+            </w:tcBorders>
           </w:tcPr>
           <w:p>
             <w:pPr>
-              <w:spacing w:before="40" w:after="40"/>
+              <w:spacing w:before="120" w:after="40"/>
+              <w:jc w:val="center"/>
             </w:pPr>
             <w:r>
               <w:rPr>
+                <w:rFonts w:ascii="Segoe UI" w:hAnsi="Segoe UI"/>
                 <w:b/>
-                <w:color w:val="10B981"/>
-                <w:sz w:val="18"/>
+                <w:color w:val="1E3A8A"/>
+                <w:sz w:val="22"/>
               </w:rPr>
-              <w:t xml:space="preserve">📸 How to take this screenshot yourself: </w:t>
+              <w:t>📸 [SCREENSHOT PLACEHOLDER]</w:t>
+              <w:br/>
             </w:r>
             <w:r>
               <w:rPr>
+                <w:rFonts w:ascii="Segoe UI" w:hAnsi="Segoe UI"/>
+                <w:b/>
+                <w:color w:val="475569"/>
+                <w:sz w:val="19"/>
+              </w:rPr>
+              <w:t>Figure: Figure 2.2 — Verification of java, javac and JAVA_HOME in Command Prompt</w:t>
+              <w:br/>
+            </w:r>
+          </w:p>
+          <w:p>
+            <w:pPr>
+              <w:spacing w:before="80" w:after="80"/>
+              <w:jc w:val="left"/>
+            </w:pPr>
+            <w:r>
+              <w:rPr>
+                <w:rFonts w:ascii="Segoe UI" w:hAnsi="Segoe UI"/>
+                <w:b/>
+                <w:color w:val="0D9488"/>
+                <w:sz w:val="18"/>
+              </w:rPr>
+              <w:t>👉 Asli Screenshot Lene Ka Tareeqa:</w:t>
+              <w:br/>
+            </w:r>
+            <w:r>
+              <w:rPr>
+                <w:rFonts w:ascii="Segoe UI" w:hAnsi="Segoe UI"/>
                 <w:color w:val="1F2937"/>
                 <w:sz w:val="17"/>
               </w:rPr>
               <w:t>Open a new cmd window, run 'java -version', 'javac -version', and 'echo %JAVA_HOME%'. Capture output.</w:t>
+              <w:br/>
+            </w:r>
+            <w:r>
+              <w:rPr>
+                <w:rFonts w:ascii="Segoe UI" w:hAnsi="Segoe UI"/>
+                <w:i/>
+                <w:color w:val="64748B"/>
+                <w:sz w:val="17"/>
+              </w:rPr>
+              <w:t>📋 Paste karne ke liye: Win + Shift + S dabakar snip karein -&gt; Word mein yahan click karke Ctrl + V dabayein</w:t>
             </w:r>
           </w:p>
         </w:tc>
@@ -1532,7 +1478,7 @@
     </w:tbl>
     <w:p>
       <w:pPr>
-        <w:spacing w:after="120"/>
+        <w:spacing w:after="160"/>
       </w:pPr>
     </w:p>
     <w:p>
@@ -1574,61 +1520,6 @@
         <w:t>3. Appended C:\Tools\apache-maven\bin to the system Path variable.</w:t>
       </w:r>
     </w:p>
-    <w:p>
-      <w:pPr>
-        <w:spacing w:before="120" w:after="80"/>
-        <w:jc w:val="center"/>
-      </w:pPr>
-      <w:r>
-        <w:drawing>
-          <wp:inline xmlns:a="http://schemas.openxmlformats.org/drawingml/2006/main" xmlns:pic="http://schemas.openxmlformats.org/drawingml/2006/picture">
-            <wp:extent cx="5669280" cy="2163278"/>
-            <wp:docPr id="7" name="Picture 7"/>
-            <wp:cNvGraphicFramePr>
-              <a:graphicFrameLocks noChangeAspect="1"/>
-            </wp:cNvGraphicFramePr>
-            <a:graphic>
-              <a:graphicData uri="http://schemas.openxmlformats.org/drawingml/2006/picture">
-                <pic:pic>
-                  <pic:nvPicPr>
-                    <pic:cNvPr id="0" name="screenshot_3_1_maven_env.png"/>
-                    <pic:cNvPicPr/>
-                  </pic:nvPicPr>
-                  <pic:blipFill>
-                    <a:blip r:embed="rId15"/>
-                    <a:stretch>
-                      <a:fillRect/>
-                    </a:stretch>
-                  </pic:blipFill>
-                  <pic:spPr>
-                    <a:xfrm>
-                      <a:off x="0" y="0"/>
-                      <a:ext cx="5669280" cy="2163278"/>
-                    </a:xfrm>
-                    <a:prstGeom prst="rect"/>
-                  </pic:spPr>
-                </pic:pic>
-              </a:graphicData>
-            </a:graphic>
-          </wp:inline>
-        </w:drawing>
-      </w:r>
-    </w:p>
-    <w:p>
-      <w:pPr>
-        <w:spacing w:before="40" w:after="120"/>
-        <w:jc w:val="center"/>
-      </w:pPr>
-      <w:r>
-        <w:rPr>
-          <w:rFonts w:ascii="Segoe UI" w:hAnsi="Segoe UI"/>
-          <w:i/>
-          <w:color w:val="6B7280"/>
-          <w:sz w:val="18"/>
-        </w:rPr>
-        <w:t>Figure: Figure 3.1 — Apache Maven bin directory appended to System Path</w:t>
-      </w:r>
-    </w:p>
     <w:tbl>
       <w:tblPr>
         <w:tblW w:type="auto" w:w="0"/>
@@ -1642,32 +1533,78 @@
         <w:tc>
           <w:tcPr>
             <w:tcW w:type="dxa" w:w="9648"/>
-            <w:shd w:fill="F9FAFB"/>
+            <w:shd w:fill="F8FAFC"/>
             <w:tcMar>
-              <w:top w:w="100" w:type="dxa"/>
-              <w:bottom w:w="100" w:type="dxa"/>
-              <w:left w:w="150" w:type="dxa"/>
-              <w:right w:w="150" w:type="dxa"/>
+              <w:top w:w="140" w:type="dxa"/>
+              <w:bottom w:w="140" w:type="dxa"/>
+              <w:left w:w="180" w:type="dxa"/>
+              <w:right w:w="180" w:type="dxa"/>
             </w:tcMar>
+            <w:tcBorders>
+              <w:top w:val="dashed" w:sz="16" w:space="0" w:color="94A3B8"/>
+              <w:left w:val="dashed" w:sz="16" w:space="0" w:color="94A3B8"/>
+              <w:bottom w:val="dashed" w:sz="16" w:space="0" w:color="94A3B8"/>
+              <w:right w:val="dashed" w:sz="16" w:space="0" w:color="94A3B8"/>
+            </w:tcBorders>
           </w:tcPr>
           <w:p>
             <w:pPr>
-              <w:spacing w:before="40" w:after="40"/>
+              <w:spacing w:before="120" w:after="40"/>
+              <w:jc w:val="center"/>
             </w:pPr>
             <w:r>
               <w:rPr>
+                <w:rFonts w:ascii="Segoe UI" w:hAnsi="Segoe UI"/>
                 <w:b/>
-                <w:color w:val="10B981"/>
-                <w:sz w:val="18"/>
+                <w:color w:val="1E3A8A"/>
+                <w:sz w:val="22"/>
               </w:rPr>
-              <w:t xml:space="preserve">📸 How to take this screenshot yourself: </w:t>
+              <w:t>📸 [SCREENSHOT PLACEHOLDER]</w:t>
+              <w:br/>
             </w:r>
             <w:r>
               <w:rPr>
+                <w:rFonts w:ascii="Segoe UI" w:hAnsi="Segoe UI"/>
+                <w:b/>
+                <w:color w:val="475569"/>
+                <w:sz w:val="19"/>
+              </w:rPr>
+              <w:t>Figure: Figure 3.1 — Apache Maven bin directory appended to System Path</w:t>
+              <w:br/>
+            </w:r>
+          </w:p>
+          <w:p>
+            <w:pPr>
+              <w:spacing w:before="80" w:after="80"/>
+              <w:jc w:val="left"/>
+            </w:pPr>
+            <w:r>
+              <w:rPr>
+                <w:rFonts w:ascii="Segoe UI" w:hAnsi="Segoe UI"/>
+                <w:b/>
+                <w:color w:val="0D9488"/>
+                <w:sz w:val="18"/>
+              </w:rPr>
+              <w:t>👉 Asli Screenshot Lene Ka Tareeqa:</w:t>
+              <w:br/>
+            </w:r>
+            <w:r>
+              <w:rPr>
+                <w:rFonts w:ascii="Segoe UI" w:hAnsi="Segoe UI"/>
                 <w:color w:val="1F2937"/>
                 <w:sz w:val="17"/>
               </w:rPr>
               <w:t>Open Environment Variables -&gt; Edit Path -&gt; select the row with 'C:\Tools\apache-maven\bin' and take a screenshot.</w:t>
+              <w:br/>
+            </w:r>
+            <w:r>
+              <w:rPr>
+                <w:rFonts w:ascii="Segoe UI" w:hAnsi="Segoe UI"/>
+                <w:i/>
+                <w:color w:val="64748B"/>
+                <w:sz w:val="17"/>
+              </w:rPr>
+              <w:t>📋 Paste karne ke liye: Win + Shift + S dabakar snip karein -&gt; Word mein yahan click karke Ctrl + V dabayein</w:t>
             </w:r>
           </w:p>
         </w:tc>
@@ -1675,7 +1612,7 @@
     </w:tbl>
     <w:p>
       <w:pPr>
-        <w:spacing w:after="120"/>
+        <w:spacing w:after="160"/>
       </w:pPr>
     </w:p>
     <w:p>
@@ -1748,61 +1685,6 @@
         <w:spacing w:after="80"/>
       </w:pPr>
     </w:p>
-    <w:p>
-      <w:pPr>
-        <w:spacing w:before="120" w:after="80"/>
-        <w:jc w:val="center"/>
-      </w:pPr>
-      <w:r>
-        <w:drawing>
-          <wp:inline xmlns:a="http://schemas.openxmlformats.org/drawingml/2006/main" xmlns:pic="http://schemas.openxmlformats.org/drawingml/2006/picture">
-            <wp:extent cx="5669280" cy="1423619"/>
-            <wp:docPr id="8" name="Picture 8"/>
-            <wp:cNvGraphicFramePr>
-              <a:graphicFrameLocks noChangeAspect="1"/>
-            </wp:cNvGraphicFramePr>
-            <a:graphic>
-              <a:graphicData uri="http://schemas.openxmlformats.org/drawingml/2006/picture">
-                <pic:pic>
-                  <pic:nvPicPr>
-                    <pic:cNvPr id="0" name="screenshot_3_2_maven_verify.png"/>
-                    <pic:cNvPicPr/>
-                  </pic:nvPicPr>
-                  <pic:blipFill>
-                    <a:blip r:embed="rId16"/>
-                    <a:stretch>
-                      <a:fillRect/>
-                    </a:stretch>
-                  </pic:blipFill>
-                  <pic:spPr>
-                    <a:xfrm>
-                      <a:off x="0" y="0"/>
-                      <a:ext cx="5669280" cy="1423619"/>
-                    </a:xfrm>
-                    <a:prstGeom prst="rect"/>
-                  </pic:spPr>
-                </pic:pic>
-              </a:graphicData>
-            </a:graphic>
-          </wp:inline>
-        </w:drawing>
-      </w:r>
-    </w:p>
-    <w:p>
-      <w:pPr>
-        <w:spacing w:before="40" w:after="120"/>
-        <w:jc w:val="center"/>
-      </w:pPr>
-      <w:r>
-        <w:rPr>
-          <w:rFonts w:ascii="Segoe UI" w:hAnsi="Segoe UI"/>
-          <w:i/>
-          <w:color w:val="6B7280"/>
-          <w:sz w:val="18"/>
-        </w:rPr>
-        <w:t>Figure: Figure 3.2 — Maven Version, Home Directory, and Java 17 Runtime Association</w:t>
-      </w:r>
-    </w:p>
     <w:tbl>
       <w:tblPr>
         <w:tblW w:type="auto" w:w="0"/>
@@ -1816,32 +1698,78 @@
         <w:tc>
           <w:tcPr>
             <w:tcW w:type="dxa" w:w="9648"/>
-            <w:shd w:fill="F9FAFB"/>
+            <w:shd w:fill="F8FAFC"/>
             <w:tcMar>
-              <w:top w:w="100" w:type="dxa"/>
-              <w:bottom w:w="100" w:type="dxa"/>
-              <w:left w:w="150" w:type="dxa"/>
-              <w:right w:w="150" w:type="dxa"/>
+              <w:top w:w="140" w:type="dxa"/>
+              <w:bottom w:w="140" w:type="dxa"/>
+              <w:left w:w="180" w:type="dxa"/>
+              <w:right w:w="180" w:type="dxa"/>
             </w:tcMar>
+            <w:tcBorders>
+              <w:top w:val="dashed" w:sz="16" w:space="0" w:color="94A3B8"/>
+              <w:left w:val="dashed" w:sz="16" w:space="0" w:color="94A3B8"/>
+              <w:bottom w:val="dashed" w:sz="16" w:space="0" w:color="94A3B8"/>
+              <w:right w:val="dashed" w:sz="16" w:space="0" w:color="94A3B8"/>
+            </w:tcBorders>
           </w:tcPr>
           <w:p>
             <w:pPr>
-              <w:spacing w:before="40" w:after="40"/>
+              <w:spacing w:before="120" w:after="40"/>
+              <w:jc w:val="center"/>
             </w:pPr>
             <w:r>
               <w:rPr>
+                <w:rFonts w:ascii="Segoe UI" w:hAnsi="Segoe UI"/>
                 <w:b/>
-                <w:color w:val="10B981"/>
-                <w:sz w:val="18"/>
+                <w:color w:val="1E3A8A"/>
+                <w:sz w:val="22"/>
               </w:rPr>
-              <w:t xml:space="preserve">📸 How to take this screenshot yourself: </w:t>
+              <w:t>📸 [SCREENSHOT PLACEHOLDER]</w:t>
+              <w:br/>
             </w:r>
             <w:r>
               <w:rPr>
+                <w:rFonts w:ascii="Segoe UI" w:hAnsi="Segoe UI"/>
+                <w:b/>
+                <w:color w:val="475569"/>
+                <w:sz w:val="19"/>
+              </w:rPr>
+              <w:t>Figure: Figure 3.2 — Maven Version, Home Directory, and Java 17 Runtime Association</w:t>
+              <w:br/>
+            </w:r>
+          </w:p>
+          <w:p>
+            <w:pPr>
+              <w:spacing w:before="80" w:after="80"/>
+              <w:jc w:val="left"/>
+            </w:pPr>
+            <w:r>
+              <w:rPr>
+                <w:rFonts w:ascii="Segoe UI" w:hAnsi="Segoe UI"/>
+                <w:b/>
+                <w:color w:val="0D9488"/>
+                <w:sz w:val="18"/>
+              </w:rPr>
+              <w:t>👉 Asli Screenshot Lene Ka Tareeqa:</w:t>
+              <w:br/>
+            </w:r>
+            <w:r>
+              <w:rPr>
+                <w:rFonts w:ascii="Segoe UI" w:hAnsi="Segoe UI"/>
                 <w:color w:val="1F2937"/>
                 <w:sz w:val="17"/>
               </w:rPr>
               <w:t>In cmd, run 'mvn -version' and capture the displayed Maven version and Java runtime path.</w:t>
+              <w:br/>
+            </w:r>
+            <w:r>
+              <w:rPr>
+                <w:rFonts w:ascii="Segoe UI" w:hAnsi="Segoe UI"/>
+                <w:i/>
+                <w:color w:val="64748B"/>
+                <w:sz w:val="17"/>
+              </w:rPr>
+              <w:t>📋 Paste karne ke liye: Win + Shift + S dabakar snip karein -&gt; Word mein yahan click karke Ctrl + V dabayein</w:t>
             </w:r>
           </w:p>
         </w:tc>
@@ -1849,7 +1777,7 @@
     </w:tbl>
     <w:p>
       <w:pPr>
-        <w:spacing w:after="120"/>
+        <w:spacing w:after="160"/>
       </w:pPr>
     </w:p>
     <w:p>
@@ -1895,61 +1823,6 @@
         <w:t>• src/main/webapp/ — Web application root containing index.html, style.css, script.js, and WEB-INF/web.xml.</w:t>
       </w:r>
     </w:p>
-    <w:p>
-      <w:pPr>
-        <w:spacing w:before="120" w:after="80"/>
-        <w:jc w:val="center"/>
-      </w:pPr>
-      <w:r>
-        <w:drawing>
-          <wp:inline xmlns:a="http://schemas.openxmlformats.org/drawingml/2006/main" xmlns:pic="http://schemas.openxmlformats.org/drawingml/2006/picture">
-            <wp:extent cx="5669280" cy="1555902"/>
-            <wp:docPr id="9" name="Picture 9"/>
-            <wp:cNvGraphicFramePr>
-              <a:graphicFrameLocks noChangeAspect="1"/>
-            </wp:cNvGraphicFramePr>
-            <a:graphic>
-              <a:graphicData uri="http://schemas.openxmlformats.org/drawingml/2006/picture">
-                <pic:pic>
-                  <pic:nvPicPr>
-                    <pic:cNvPr id="0" name="screenshot_4_1_pom_check.png"/>
-                    <pic:cNvPicPr/>
-                  </pic:nvPicPr>
-                  <pic:blipFill>
-                    <a:blip r:embed="rId17"/>
-                    <a:stretch>
-                      <a:fillRect/>
-                    </a:stretch>
-                  </pic:blipFill>
-                  <pic:spPr>
-                    <a:xfrm>
-                      <a:off x="0" y="0"/>
-                      <a:ext cx="5669280" cy="1555902"/>
-                    </a:xfrm>
-                    <a:prstGeom prst="rect"/>
-                  </pic:spPr>
-                </pic:pic>
-              </a:graphicData>
-            </a:graphic>
-          </wp:inline>
-        </w:drawing>
-      </w:r>
-    </w:p>
-    <w:p>
-      <w:pPr>
-        <w:spacing w:before="40" w:after="120"/>
-        <w:jc w:val="center"/>
-      </w:pPr>
-      <w:r>
-        <w:rPr>
-          <w:rFonts w:ascii="Segoe UI" w:hAnsi="Segoe UI"/>
-          <w:i/>
-          <w:color w:val="6B7280"/>
-          <w:sz w:val="18"/>
-        </w:rPr>
-        <w:t>Figure: Figure 4.1 — Verification of pom.xml presence in project root directory</w:t>
-      </w:r>
-    </w:p>
     <w:tbl>
       <w:tblPr>
         <w:tblW w:type="auto" w:w="0"/>
@@ -1963,32 +1836,78 @@
         <w:tc>
           <w:tcPr>
             <w:tcW w:type="dxa" w:w="9648"/>
-            <w:shd w:fill="F9FAFB"/>
+            <w:shd w:fill="F8FAFC"/>
             <w:tcMar>
-              <w:top w:w="100" w:type="dxa"/>
-              <w:bottom w:w="100" w:type="dxa"/>
-              <w:left w:w="150" w:type="dxa"/>
-              <w:right w:w="150" w:type="dxa"/>
+              <w:top w:w="140" w:type="dxa"/>
+              <w:bottom w:w="140" w:type="dxa"/>
+              <w:left w:w="180" w:type="dxa"/>
+              <w:right w:w="180" w:type="dxa"/>
             </w:tcMar>
+            <w:tcBorders>
+              <w:top w:val="dashed" w:sz="16" w:space="0" w:color="94A3B8"/>
+              <w:left w:val="dashed" w:sz="16" w:space="0" w:color="94A3B8"/>
+              <w:bottom w:val="dashed" w:sz="16" w:space="0" w:color="94A3B8"/>
+              <w:right w:val="dashed" w:sz="16" w:space="0" w:color="94A3B8"/>
+            </w:tcBorders>
           </w:tcPr>
           <w:p>
             <w:pPr>
-              <w:spacing w:before="40" w:after="40"/>
+              <w:spacing w:before="120" w:after="40"/>
+              <w:jc w:val="center"/>
             </w:pPr>
             <w:r>
               <w:rPr>
+                <w:rFonts w:ascii="Segoe UI" w:hAnsi="Segoe UI"/>
                 <w:b/>
-                <w:color w:val="10B981"/>
-                <w:sz w:val="18"/>
+                <w:color w:val="1E3A8A"/>
+                <w:sz w:val="22"/>
               </w:rPr>
-              <w:t xml:space="preserve">📸 How to take this screenshot yourself: </w:t>
+              <w:t>📸 [SCREENSHOT PLACEHOLDER]</w:t>
+              <w:br/>
             </w:r>
             <w:r>
               <w:rPr>
+                <w:rFonts w:ascii="Segoe UI" w:hAnsi="Segoe UI"/>
+                <w:b/>
+                <w:color w:val="475569"/>
+                <w:sz w:val="19"/>
+              </w:rPr>
+              <w:t>Figure: Figure 4.1 — Verification of pom.xml presence in project root directory</w:t>
+              <w:br/>
+            </w:r>
+          </w:p>
+          <w:p>
+            <w:pPr>
+              <w:spacing w:before="80" w:after="80"/>
+              <w:jc w:val="left"/>
+            </w:pPr>
+            <w:r>
+              <w:rPr>
+                <w:rFonts w:ascii="Segoe UI" w:hAnsi="Segoe UI"/>
+                <w:b/>
+                <w:color w:val="0D9488"/>
+                <w:sz w:val="18"/>
+              </w:rPr>
+              <w:t>👉 Asli Screenshot Lene Ka Tareeqa:</w:t>
+              <w:br/>
+            </w:r>
+            <w:r>
+              <w:rPr>
+                <w:rFonts w:ascii="Segoe UI" w:hAnsi="Segoe UI"/>
                 <w:color w:val="1F2937"/>
                 <w:sz w:val="17"/>
               </w:rPr>
               <w:t>Run 'dir pom.xml' in the project directory in cmd and capture with Win + Shift + S.</w:t>
+              <w:br/>
+            </w:r>
+            <w:r>
+              <w:rPr>
+                <w:rFonts w:ascii="Segoe UI" w:hAnsi="Segoe UI"/>
+                <w:i/>
+                <w:color w:val="64748B"/>
+                <w:sz w:val="17"/>
+              </w:rPr>
+              <w:t>📋 Paste karne ke liye: Win + Shift + S dabakar snip karein -&gt; Word mein yahan click karke Ctrl + V dabayein</w:t>
             </w:r>
           </w:p>
         </w:tc>
@@ -1996,7 +1915,7 @@
     </w:tbl>
     <w:p>
       <w:pPr>
-        <w:spacing w:after="120"/>
+        <w:spacing w:after="160"/>
       </w:pPr>
     </w:p>
     <w:p>
@@ -2065,61 +1984,6 @@
         <w:spacing w:after="80"/>
       </w:pPr>
     </w:p>
-    <w:p>
-      <w:pPr>
-        <w:spacing w:before="120" w:after="80"/>
-        <w:jc w:val="center"/>
-      </w:pPr>
-      <w:r>
-        <w:drawing>
-          <wp:inline xmlns:a="http://schemas.openxmlformats.org/drawingml/2006/main" xmlns:pic="http://schemas.openxmlformats.org/drawingml/2006/picture">
-            <wp:extent cx="5669280" cy="3275584"/>
-            <wp:docPr id="10" name="Picture 10"/>
-            <wp:cNvGraphicFramePr>
-              <a:graphicFrameLocks noChangeAspect="1"/>
-            </wp:cNvGraphicFramePr>
-            <a:graphic>
-              <a:graphicData uri="http://schemas.openxmlformats.org/drawingml/2006/picture">
-                <pic:pic>
-                  <pic:nvPicPr>
-                    <pic:cNvPr id="0" name="screenshot_4_2_mvn_compile.png"/>
-                    <pic:cNvPicPr/>
-                  </pic:nvPicPr>
-                  <pic:blipFill>
-                    <a:blip r:embed="rId18"/>
-                    <a:stretch>
-                      <a:fillRect/>
-                    </a:stretch>
-                  </pic:blipFill>
-                  <pic:spPr>
-                    <a:xfrm>
-                      <a:off x="0" y="0"/>
-                      <a:ext cx="5669280" cy="3275584"/>
-                    </a:xfrm>
-                    <a:prstGeom prst="rect"/>
-                  </pic:spPr>
-                </pic:pic>
-              </a:graphicData>
-            </a:graphic>
-          </wp:inline>
-        </w:drawing>
-      </w:r>
-    </w:p>
-    <w:p>
-      <w:pPr>
-        <w:spacing w:before="40" w:after="120"/>
-        <w:jc w:val="center"/>
-      </w:pPr>
-      <w:r>
-        <w:rPr>
-          <w:rFonts w:ascii="Segoe UI" w:hAnsi="Segoe UI"/>
-          <w:i/>
-          <w:color w:val="6B7280"/>
-          <w:sz w:val="18"/>
-        </w:rPr>
-        <w:t>Figure: Figure 4.2 — Execution of 'mvn compile' culminating in BUILD SUCCESS</w:t>
-      </w:r>
-    </w:p>
     <w:tbl>
       <w:tblPr>
         <w:tblW w:type="auto" w:w="0"/>
@@ -2133,32 +1997,78 @@
         <w:tc>
           <w:tcPr>
             <w:tcW w:type="dxa" w:w="9648"/>
-            <w:shd w:fill="F9FAFB"/>
+            <w:shd w:fill="F8FAFC"/>
             <w:tcMar>
-              <w:top w:w="100" w:type="dxa"/>
-              <w:bottom w:w="100" w:type="dxa"/>
-              <w:left w:w="150" w:type="dxa"/>
-              <w:right w:w="150" w:type="dxa"/>
+              <w:top w:w="140" w:type="dxa"/>
+              <w:bottom w:w="140" w:type="dxa"/>
+              <w:left w:w="180" w:type="dxa"/>
+              <w:right w:w="180" w:type="dxa"/>
             </w:tcMar>
+            <w:tcBorders>
+              <w:top w:val="dashed" w:sz="16" w:space="0" w:color="94A3B8"/>
+              <w:left w:val="dashed" w:sz="16" w:space="0" w:color="94A3B8"/>
+              <w:bottom w:val="dashed" w:sz="16" w:space="0" w:color="94A3B8"/>
+              <w:right w:val="dashed" w:sz="16" w:space="0" w:color="94A3B8"/>
+            </w:tcBorders>
           </w:tcPr>
           <w:p>
             <w:pPr>
-              <w:spacing w:before="40" w:after="40"/>
+              <w:spacing w:before="120" w:after="40"/>
+              <w:jc w:val="center"/>
             </w:pPr>
             <w:r>
               <w:rPr>
+                <w:rFonts w:ascii="Segoe UI" w:hAnsi="Segoe UI"/>
                 <w:b/>
-                <w:color w:val="10B981"/>
-                <w:sz w:val="18"/>
+                <w:color w:val="1E3A8A"/>
+                <w:sz w:val="22"/>
               </w:rPr>
-              <w:t xml:space="preserve">📸 How to take this screenshot yourself: </w:t>
+              <w:t>📸 [SCREENSHOT PLACEHOLDER]</w:t>
+              <w:br/>
             </w:r>
             <w:r>
               <w:rPr>
+                <w:rFonts w:ascii="Segoe UI" w:hAnsi="Segoe UI"/>
+                <w:b/>
+                <w:color w:val="475569"/>
+                <w:sz w:val="19"/>
+              </w:rPr>
+              <w:t>Figure: Figure 4.2 — Execution of 'mvn compile' culminating in BUILD SUCCESS</w:t>
+              <w:br/>
+            </w:r>
+          </w:p>
+          <w:p>
+            <w:pPr>
+              <w:spacing w:before="80" w:after="80"/>
+              <w:jc w:val="left"/>
+            </w:pPr>
+            <w:r>
+              <w:rPr>
+                <w:rFonts w:ascii="Segoe UI" w:hAnsi="Segoe UI"/>
+                <w:b/>
+                <w:color w:val="0D9488"/>
+                <w:sz w:val="18"/>
+              </w:rPr>
+              <w:t>👉 Asli Screenshot Lene Ka Tareeqa:</w:t>
+              <w:br/>
+            </w:r>
+            <w:r>
+              <w:rPr>
+                <w:rFonts w:ascii="Segoe UI" w:hAnsi="Segoe UI"/>
                 <w:color w:val="1F2937"/>
                 <w:sz w:val="17"/>
               </w:rPr>
               <w:t>Execute 'mvn compile' in project directory and capture the BUILD SUCCESS terminal block.</w:t>
+              <w:br/>
+            </w:r>
+            <w:r>
+              <w:rPr>
+                <w:rFonts w:ascii="Segoe UI" w:hAnsi="Segoe UI"/>
+                <w:i/>
+                <w:color w:val="64748B"/>
+                <w:sz w:val="17"/>
+              </w:rPr>
+              <w:t>📋 Paste karne ke liye: Win + Shift + S dabakar snip karein -&gt; Word mein yahan click karke Ctrl + V dabayein</w:t>
             </w:r>
           </w:p>
         </w:tc>
@@ -2166,7 +2076,7 @@
     </w:tbl>
     <w:p>
       <w:pPr>
-        <w:spacing w:after="120"/>
+        <w:spacing w:after="160"/>
       </w:pPr>
     </w:p>
     <w:p>
@@ -2235,61 +2145,6 @@
         <w:spacing w:after="80"/>
       </w:pPr>
     </w:p>
-    <w:p>
-      <w:pPr>
-        <w:spacing w:before="120" w:after="80"/>
-        <w:jc w:val="center"/>
-      </w:pPr>
-      <w:r>
-        <w:drawing>
-          <wp:inline xmlns:a="http://schemas.openxmlformats.org/drawingml/2006/main" xmlns:pic="http://schemas.openxmlformats.org/drawingml/2006/picture">
-            <wp:extent cx="5669280" cy="3937000"/>
-            <wp:docPr id="11" name="Picture 11"/>
-            <wp:cNvGraphicFramePr>
-              <a:graphicFrameLocks noChangeAspect="1"/>
-            </wp:cNvGraphicFramePr>
-            <a:graphic>
-              <a:graphicData uri="http://schemas.openxmlformats.org/drawingml/2006/picture">
-                <pic:pic>
-                  <pic:nvPicPr>
-                    <pic:cNvPr id="0" name="screenshot_4_3_mvn_test.png"/>
-                    <pic:cNvPicPr/>
-                  </pic:nvPicPr>
-                  <pic:blipFill>
-                    <a:blip r:embed="rId19"/>
-                    <a:stretch>
-                      <a:fillRect/>
-                    </a:stretch>
-                  </pic:blipFill>
-                  <pic:spPr>
-                    <a:xfrm>
-                      <a:off x="0" y="0"/>
-                      <a:ext cx="5669280" cy="3937000"/>
-                    </a:xfrm>
-                    <a:prstGeom prst="rect"/>
-                  </pic:spPr>
-                </pic:pic>
-              </a:graphicData>
-            </a:graphic>
-          </wp:inline>
-        </w:drawing>
-      </w:r>
-    </w:p>
-    <w:p>
-      <w:pPr>
-        <w:spacing w:before="40" w:after="120"/>
-        <w:jc w:val="center"/>
-      </w:pPr>
-      <w:r>
-        <w:rPr>
-          <w:rFonts w:ascii="Segoe UI" w:hAnsi="Segoe UI"/>
-          <w:i/>
-          <w:color w:val="6B7280"/>
-          <w:sz w:val="18"/>
-        </w:rPr>
-        <w:t>Figure: Figure 4.3 — Execution of 'mvn test' with 4 passing unit tests and zero errors</w:t>
-      </w:r>
-    </w:p>
     <w:tbl>
       <w:tblPr>
         <w:tblW w:type="auto" w:w="0"/>
@@ -2303,32 +2158,78 @@
         <w:tc>
           <w:tcPr>
             <w:tcW w:type="dxa" w:w="9648"/>
-            <w:shd w:fill="F9FAFB"/>
+            <w:shd w:fill="F8FAFC"/>
             <w:tcMar>
-              <w:top w:w="100" w:type="dxa"/>
-              <w:bottom w:w="100" w:type="dxa"/>
-              <w:left w:w="150" w:type="dxa"/>
-              <w:right w:w="150" w:type="dxa"/>
+              <w:top w:w="140" w:type="dxa"/>
+              <w:bottom w:w="140" w:type="dxa"/>
+              <w:left w:w="180" w:type="dxa"/>
+              <w:right w:w="180" w:type="dxa"/>
             </w:tcMar>
+            <w:tcBorders>
+              <w:top w:val="dashed" w:sz="16" w:space="0" w:color="94A3B8"/>
+              <w:left w:val="dashed" w:sz="16" w:space="0" w:color="94A3B8"/>
+              <w:bottom w:val="dashed" w:sz="16" w:space="0" w:color="94A3B8"/>
+              <w:right w:val="dashed" w:sz="16" w:space="0" w:color="94A3B8"/>
+            </w:tcBorders>
           </w:tcPr>
           <w:p>
             <w:pPr>
-              <w:spacing w:before="40" w:after="40"/>
+              <w:spacing w:before="120" w:after="40"/>
+              <w:jc w:val="center"/>
             </w:pPr>
             <w:r>
               <w:rPr>
+                <w:rFonts w:ascii="Segoe UI" w:hAnsi="Segoe UI"/>
                 <w:b/>
-                <w:color w:val="10B981"/>
-                <w:sz w:val="18"/>
+                <w:color w:val="1E3A8A"/>
+                <w:sz w:val="22"/>
               </w:rPr>
-              <w:t xml:space="preserve">📸 How to take this screenshot yourself: </w:t>
+              <w:t>📸 [SCREENSHOT PLACEHOLDER]</w:t>
+              <w:br/>
             </w:r>
             <w:r>
               <w:rPr>
+                <w:rFonts w:ascii="Segoe UI" w:hAnsi="Segoe UI"/>
+                <w:b/>
+                <w:color w:val="475569"/>
+                <w:sz w:val="19"/>
+              </w:rPr>
+              <w:t>Figure: Figure 4.3 — Execution of 'mvn test' with 4 passing unit tests and zero errors</w:t>
+              <w:br/>
+            </w:r>
+          </w:p>
+          <w:p>
+            <w:pPr>
+              <w:spacing w:before="80" w:after="80"/>
+              <w:jc w:val="left"/>
+            </w:pPr>
+            <w:r>
+              <w:rPr>
+                <w:rFonts w:ascii="Segoe UI" w:hAnsi="Segoe UI"/>
+                <w:b/>
+                <w:color w:val="0D9488"/>
+                <w:sz w:val="18"/>
+              </w:rPr>
+              <w:t>👉 Asli Screenshot Lene Ka Tareeqa:</w:t>
+              <w:br/>
+            </w:r>
+            <w:r>
+              <w:rPr>
+                <w:rFonts w:ascii="Segoe UI" w:hAnsi="Segoe UI"/>
                 <w:color w:val="1F2937"/>
                 <w:sz w:val="17"/>
               </w:rPr>
               <w:t>Execute 'mvn test' in project directory and capture the test summary and BUILD SUCCESS.</w:t>
+              <w:br/>
+            </w:r>
+            <w:r>
+              <w:rPr>
+                <w:rFonts w:ascii="Segoe UI" w:hAnsi="Segoe UI"/>
+                <w:i/>
+                <w:color w:val="64748B"/>
+                <w:sz w:val="17"/>
+              </w:rPr>
+              <w:t>📋 Paste karne ke liye: Win + Shift + S dabakar snip karein -&gt; Word mein yahan click karke Ctrl + V dabayein</w:t>
             </w:r>
           </w:p>
         </w:tc>
@@ -2336,7 +2237,7 @@
     </w:tbl>
     <w:p>
       <w:pPr>
-        <w:spacing w:after="120"/>
+        <w:spacing w:after="160"/>
       </w:pPr>
     </w:p>
     <w:p>
@@ -2405,61 +2306,6 @@
         <w:spacing w:after="80"/>
       </w:pPr>
     </w:p>
-    <w:p>
-      <w:pPr>
-        <w:spacing w:before="120" w:after="80"/>
-        <w:jc w:val="center"/>
-      </w:pPr>
-      <w:r>
-        <w:drawing>
-          <wp:inline xmlns:a="http://schemas.openxmlformats.org/drawingml/2006/main" xmlns:pic="http://schemas.openxmlformats.org/drawingml/2006/picture">
-            <wp:extent cx="5669280" cy="3407867"/>
-            <wp:docPr id="12" name="Picture 12"/>
-            <wp:cNvGraphicFramePr>
-              <a:graphicFrameLocks noChangeAspect="1"/>
-            </wp:cNvGraphicFramePr>
-            <a:graphic>
-              <a:graphicData uri="http://schemas.openxmlformats.org/drawingml/2006/picture">
-                <pic:pic>
-                  <pic:nvPicPr>
-                    <pic:cNvPr id="0" name="screenshot_4_4_mvn_package.png"/>
-                    <pic:cNvPicPr/>
-                  </pic:nvPicPr>
-                  <pic:blipFill>
-                    <a:blip r:embed="rId20"/>
-                    <a:stretch>
-                      <a:fillRect/>
-                    </a:stretch>
-                  </pic:blipFill>
-                  <pic:spPr>
-                    <a:xfrm>
-                      <a:off x="0" y="0"/>
-                      <a:ext cx="5669280" cy="3407867"/>
-                    </a:xfrm>
-                    <a:prstGeom prst="rect"/>
-                  </pic:spPr>
-                </pic:pic>
-              </a:graphicData>
-            </a:graphic>
-          </wp:inline>
-        </w:drawing>
-      </w:r>
-    </w:p>
-    <w:p>
-      <w:pPr>
-        <w:spacing w:before="40" w:after="120"/>
-        <w:jc w:val="center"/>
-      </w:pPr>
-      <w:r>
-        <w:rPr>
-          <w:rFonts w:ascii="Segoe UI" w:hAnsi="Segoe UI"/>
-          <w:i/>
-          <w:color w:val="6B7280"/>
-          <w:sz w:val="18"/>
-        </w:rPr>
-        <w:t>Figure: Figure 4.4 — Execution of 'mvn clean package' producing the deployable WAR archive</w:t>
-      </w:r>
-    </w:p>
     <w:tbl>
       <w:tblPr>
         <w:tblW w:type="auto" w:w="0"/>
@@ -2473,32 +2319,78 @@
         <w:tc>
           <w:tcPr>
             <w:tcW w:type="dxa" w:w="9648"/>
-            <w:shd w:fill="F9FAFB"/>
+            <w:shd w:fill="F8FAFC"/>
             <w:tcMar>
-              <w:top w:w="100" w:type="dxa"/>
-              <w:bottom w:w="100" w:type="dxa"/>
-              <w:left w:w="150" w:type="dxa"/>
-              <w:right w:w="150" w:type="dxa"/>
+              <w:top w:w="140" w:type="dxa"/>
+              <w:bottom w:w="140" w:type="dxa"/>
+              <w:left w:w="180" w:type="dxa"/>
+              <w:right w:w="180" w:type="dxa"/>
             </w:tcMar>
+            <w:tcBorders>
+              <w:top w:val="dashed" w:sz="16" w:space="0" w:color="94A3B8"/>
+              <w:left w:val="dashed" w:sz="16" w:space="0" w:color="94A3B8"/>
+              <w:bottom w:val="dashed" w:sz="16" w:space="0" w:color="94A3B8"/>
+              <w:right w:val="dashed" w:sz="16" w:space="0" w:color="94A3B8"/>
+            </w:tcBorders>
           </w:tcPr>
           <w:p>
             <w:pPr>
-              <w:spacing w:before="40" w:after="40"/>
+              <w:spacing w:before="120" w:after="40"/>
+              <w:jc w:val="center"/>
             </w:pPr>
             <w:r>
               <w:rPr>
+                <w:rFonts w:ascii="Segoe UI" w:hAnsi="Segoe UI"/>
                 <w:b/>
-                <w:color w:val="10B981"/>
-                <w:sz w:val="18"/>
+                <w:color w:val="1E3A8A"/>
+                <w:sz w:val="22"/>
               </w:rPr>
-              <w:t xml:space="preserve">📸 How to take this screenshot yourself: </w:t>
+              <w:t>📸 [SCREENSHOT PLACEHOLDER]</w:t>
+              <w:br/>
             </w:r>
             <w:r>
               <w:rPr>
+                <w:rFonts w:ascii="Segoe UI" w:hAnsi="Segoe UI"/>
+                <w:b/>
+                <w:color w:val="475569"/>
+                <w:sz w:val="19"/>
+              </w:rPr>
+              <w:t>Figure: Figure 4.4 — Execution of 'mvn clean package' producing the deployable WAR archive</w:t>
+              <w:br/>
+            </w:r>
+          </w:p>
+          <w:p>
+            <w:pPr>
+              <w:spacing w:before="80" w:after="80"/>
+              <w:jc w:val="left"/>
+            </w:pPr>
+            <w:r>
+              <w:rPr>
+                <w:rFonts w:ascii="Segoe UI" w:hAnsi="Segoe UI"/>
+                <w:b/>
+                <w:color w:val="0D9488"/>
+                <w:sz w:val="18"/>
+              </w:rPr>
+              <w:t>👉 Asli Screenshot Lene Ka Tareeqa:</w:t>
+              <w:br/>
+            </w:r>
+            <w:r>
+              <w:rPr>
+                <w:rFonts w:ascii="Segoe UI" w:hAnsi="Segoe UI"/>
                 <w:color w:val="1F2937"/>
                 <w:sz w:val="17"/>
               </w:rPr>
               <w:t>Execute 'mvn clean package' and capture the war assembling and packaging output.</w:t>
+              <w:br/>
+            </w:r>
+            <w:r>
+              <w:rPr>
+                <w:rFonts w:ascii="Segoe UI" w:hAnsi="Segoe UI"/>
+                <w:i/>
+                <w:color w:val="64748B"/>
+                <w:sz w:val="17"/>
+              </w:rPr>
+              <w:t>📋 Paste karne ke liye: Win + Shift + S dabakar snip karein -&gt; Word mein yahan click karke Ctrl + V dabayein</w:t>
             </w:r>
           </w:p>
         </w:tc>
@@ -2506,7 +2398,7 @@
     </w:tbl>
     <w:p>
       <w:pPr>
-        <w:spacing w:after="120"/>
+        <w:spacing w:after="160"/>
       </w:pPr>
     </w:p>
     <w:p>
@@ -2571,61 +2463,6 @@
         <w:spacing w:after="80"/>
       </w:pPr>
     </w:p>
-    <w:p>
-      <w:pPr>
-        <w:spacing w:before="120" w:after="80"/>
-        <w:jc w:val="center"/>
-      </w:pPr>
-      <w:r>
-        <w:drawing>
-          <wp:inline xmlns:a="http://schemas.openxmlformats.org/drawingml/2006/main" xmlns:pic="http://schemas.openxmlformats.org/drawingml/2006/picture">
-            <wp:extent cx="5669280" cy="1555902"/>
-            <wp:docPr id="13" name="Picture 13"/>
-            <wp:cNvGraphicFramePr>
-              <a:graphicFrameLocks noChangeAspect="1"/>
-            </wp:cNvGraphicFramePr>
-            <a:graphic>
-              <a:graphicData uri="http://schemas.openxmlformats.org/drawingml/2006/picture">
-                <pic:pic>
-                  <pic:nvPicPr>
-                    <pic:cNvPr id="0" name="screenshot_4_5_war_check.png"/>
-                    <pic:cNvPicPr/>
-                  </pic:nvPicPr>
-                  <pic:blipFill>
-                    <a:blip r:embed="rId21"/>
-                    <a:stretch>
-                      <a:fillRect/>
-                    </a:stretch>
-                  </pic:blipFill>
-                  <pic:spPr>
-                    <a:xfrm>
-                      <a:off x="0" y="0"/>
-                      <a:ext cx="5669280" cy="1555902"/>
-                    </a:xfrm>
-                    <a:prstGeom prst="rect"/>
-                  </pic:spPr>
-                </pic:pic>
-              </a:graphicData>
-            </a:graphic>
-          </wp:inline>
-        </w:drawing>
-      </w:r>
-    </w:p>
-    <w:p>
-      <w:pPr>
-        <w:spacing w:before="40" w:after="120"/>
-        <w:jc w:val="center"/>
-      </w:pPr>
-      <w:r>
-        <w:rPr>
-          <w:rFonts w:ascii="Segoe UI" w:hAnsi="Segoe UI"/>
-          <w:i/>
-          <w:color w:val="6B7280"/>
-          <w:sz w:val="18"/>
-        </w:rPr>
-        <w:t>Figure: Figure 4.5 — Verification of student-task-manager.war inside the target directory</w:t>
-      </w:r>
-    </w:p>
     <w:tbl>
       <w:tblPr>
         <w:tblW w:type="auto" w:w="0"/>
@@ -2639,32 +2476,78 @@
         <w:tc>
           <w:tcPr>
             <w:tcW w:type="dxa" w:w="9648"/>
-            <w:shd w:fill="F9FAFB"/>
+            <w:shd w:fill="F8FAFC"/>
             <w:tcMar>
-              <w:top w:w="100" w:type="dxa"/>
-              <w:bottom w:w="100" w:type="dxa"/>
-              <w:left w:w="150" w:type="dxa"/>
-              <w:right w:w="150" w:type="dxa"/>
+              <w:top w:w="140" w:type="dxa"/>
+              <w:bottom w:w="140" w:type="dxa"/>
+              <w:left w:w="180" w:type="dxa"/>
+              <w:right w:w="180" w:type="dxa"/>
             </w:tcMar>
+            <w:tcBorders>
+              <w:top w:val="dashed" w:sz="16" w:space="0" w:color="94A3B8"/>
+              <w:left w:val="dashed" w:sz="16" w:space="0" w:color="94A3B8"/>
+              <w:bottom w:val="dashed" w:sz="16" w:space="0" w:color="94A3B8"/>
+              <w:right w:val="dashed" w:sz="16" w:space="0" w:color="94A3B8"/>
+            </w:tcBorders>
           </w:tcPr>
           <w:p>
             <w:pPr>
-              <w:spacing w:before="40" w:after="40"/>
+              <w:spacing w:before="120" w:after="40"/>
+              <w:jc w:val="center"/>
             </w:pPr>
             <w:r>
               <w:rPr>
+                <w:rFonts w:ascii="Segoe UI" w:hAnsi="Segoe UI"/>
                 <w:b/>
-                <w:color w:val="10B981"/>
-                <w:sz w:val="18"/>
+                <w:color w:val="1E3A8A"/>
+                <w:sz w:val="22"/>
               </w:rPr>
-              <w:t xml:space="preserve">📸 How to take this screenshot yourself: </w:t>
+              <w:t>📸 [SCREENSHOT PLACEHOLDER]</w:t>
+              <w:br/>
             </w:r>
             <w:r>
               <w:rPr>
+                <w:rFonts w:ascii="Segoe UI" w:hAnsi="Segoe UI"/>
+                <w:b/>
+                <w:color w:val="475569"/>
+                <w:sz w:val="19"/>
+              </w:rPr>
+              <w:t>Figure: Figure 4.5 — Verification of student-task-manager.war inside the target directory</w:t>
+              <w:br/>
+            </w:r>
+          </w:p>
+          <w:p>
+            <w:pPr>
+              <w:spacing w:before="80" w:after="80"/>
+              <w:jc w:val="left"/>
+            </w:pPr>
+            <w:r>
+              <w:rPr>
+                <w:rFonts w:ascii="Segoe UI" w:hAnsi="Segoe UI"/>
+                <w:b/>
+                <w:color w:val="0D9488"/>
+                <w:sz w:val="18"/>
+              </w:rPr>
+              <w:t>👉 Asli Screenshot Lene Ka Tareeqa:</w:t>
+              <w:br/>
+            </w:r>
+            <w:r>
+              <w:rPr>
+                <w:rFonts w:ascii="Segoe UI" w:hAnsi="Segoe UI"/>
                 <w:color w:val="1F2937"/>
                 <w:sz w:val="17"/>
               </w:rPr>
               <w:t>Run 'dir target\*.war' in cmd and capture the resulting file listing.</w:t>
+              <w:br/>
+            </w:r>
+            <w:r>
+              <w:rPr>
+                <w:rFonts w:ascii="Segoe UI" w:hAnsi="Segoe UI"/>
+                <w:i/>
+                <w:color w:val="64748B"/>
+                <w:sz w:val="17"/>
+              </w:rPr>
+              <w:t>📋 Paste karne ke liye: Win + Shift + S dabakar snip karein -&gt; Word mein yahan click karke Ctrl + V dabayein</w:t>
             </w:r>
           </w:p>
         </w:tc>
@@ -2672,7 +2555,7 @@
     </w:tbl>
     <w:p>
       <w:pPr>
-        <w:spacing w:after="120"/>
+        <w:spacing w:after="160"/>
       </w:pPr>
     </w:p>
     <w:p>
@@ -2757,61 +2640,6 @@
         <w:spacing w:after="80"/>
       </w:pPr>
     </w:p>
-    <w:p>
-      <w:pPr>
-        <w:spacing w:before="120" w:after="80"/>
-        <w:jc w:val="center"/>
-      </w:pPr>
-      <w:r>
-        <w:drawing>
-          <wp:inline xmlns:a="http://schemas.openxmlformats.org/drawingml/2006/main" xmlns:pic="http://schemas.openxmlformats.org/drawingml/2006/picture">
-            <wp:extent cx="5669280" cy="1688186"/>
-            <wp:docPr id="14" name="Picture 14"/>
-            <wp:cNvGraphicFramePr>
-              <a:graphicFrameLocks noChangeAspect="1"/>
-            </wp:cNvGraphicFramePr>
-            <a:graphic>
-              <a:graphicData uri="http://schemas.openxmlformats.org/drawingml/2006/picture">
-                <pic:pic>
-                  <pic:nvPicPr>
-                    <pic:cNvPr id="0" name="screenshot_5_1_tomcat_webapps.png"/>
-                    <pic:cNvPicPr/>
-                  </pic:nvPicPr>
-                  <pic:blipFill>
-                    <a:blip r:embed="rId22"/>
-                    <a:stretch>
-                      <a:fillRect/>
-                    </a:stretch>
-                  </pic:blipFill>
-                  <pic:spPr>
-                    <a:xfrm>
-                      <a:off x="0" y="0"/>
-                      <a:ext cx="5669280" cy="1688186"/>
-                    </a:xfrm>
-                    <a:prstGeom prst="rect"/>
-                  </pic:spPr>
-                </pic:pic>
-              </a:graphicData>
-            </a:graphic>
-          </wp:inline>
-        </w:drawing>
-      </w:r>
-    </w:p>
-    <w:p>
-      <w:pPr>
-        <w:spacing w:before="40" w:after="120"/>
-        <w:jc w:val="center"/>
-      </w:pPr>
-      <w:r>
-        <w:rPr>
-          <w:rFonts w:ascii="Segoe UI" w:hAnsi="Segoe UI"/>
-          <w:i/>
-          <w:color w:val="6B7280"/>
-          <w:sz w:val="18"/>
-        </w:rPr>
-        <w:t>Figure: Figure 5.1 — Copying student-task-manager.war into C:\Tomcat\webapps Directory</w:t>
-      </w:r>
-    </w:p>
     <w:tbl>
       <w:tblPr>
         <w:tblW w:type="auto" w:w="0"/>
@@ -2825,32 +2653,78 @@
         <w:tc>
           <w:tcPr>
             <w:tcW w:type="dxa" w:w="9648"/>
-            <w:shd w:fill="F9FAFB"/>
+            <w:shd w:fill="F8FAFC"/>
             <w:tcMar>
-              <w:top w:w="100" w:type="dxa"/>
-              <w:bottom w:w="100" w:type="dxa"/>
-              <w:left w:w="150" w:type="dxa"/>
-              <w:right w:w="150" w:type="dxa"/>
+              <w:top w:w="140" w:type="dxa"/>
+              <w:bottom w:w="140" w:type="dxa"/>
+              <w:left w:w="180" w:type="dxa"/>
+              <w:right w:w="180" w:type="dxa"/>
             </w:tcMar>
+            <w:tcBorders>
+              <w:top w:val="dashed" w:sz="16" w:space="0" w:color="94A3B8"/>
+              <w:left w:val="dashed" w:sz="16" w:space="0" w:color="94A3B8"/>
+              <w:bottom w:val="dashed" w:sz="16" w:space="0" w:color="94A3B8"/>
+              <w:right w:val="dashed" w:sz="16" w:space="0" w:color="94A3B8"/>
+            </w:tcBorders>
           </w:tcPr>
           <w:p>
             <w:pPr>
-              <w:spacing w:before="40" w:after="40"/>
+              <w:spacing w:before="120" w:after="40"/>
+              <w:jc w:val="center"/>
             </w:pPr>
             <w:r>
               <w:rPr>
+                <w:rFonts w:ascii="Segoe UI" w:hAnsi="Segoe UI"/>
                 <w:b/>
-                <w:color w:val="10B981"/>
-                <w:sz w:val="18"/>
+                <w:color w:val="1E3A8A"/>
+                <w:sz w:val="22"/>
               </w:rPr>
-              <w:t xml:space="preserve">📸 How to take this screenshot yourself: </w:t>
+              <w:t>📸 [SCREENSHOT PLACEHOLDER]</w:t>
+              <w:br/>
             </w:r>
             <w:r>
               <w:rPr>
+                <w:rFonts w:ascii="Segoe UI" w:hAnsi="Segoe UI"/>
+                <w:b/>
+                <w:color w:val="475569"/>
+                <w:sz w:val="19"/>
+              </w:rPr>
+              <w:t>Figure: Figure 5.1 — Copying student-task-manager.war into C:\Tomcat\webapps Directory</w:t>
+              <w:br/>
+            </w:r>
+          </w:p>
+          <w:p>
+            <w:pPr>
+              <w:spacing w:before="80" w:after="80"/>
+              <w:jc w:val="left"/>
+            </w:pPr>
+            <w:r>
+              <w:rPr>
+                <w:rFonts w:ascii="Segoe UI" w:hAnsi="Segoe UI"/>
+                <w:b/>
+                <w:color w:val="0D9488"/>
+                <w:sz w:val="18"/>
+              </w:rPr>
+              <w:t>👉 Asli Screenshot Lene Ka Tareeqa:</w:t>
+              <w:br/>
+            </w:r>
+            <w:r>
+              <w:rPr>
+                <w:rFonts w:ascii="Segoe UI" w:hAnsi="Segoe UI"/>
                 <w:color w:val="1F2937"/>
                 <w:sz w:val="17"/>
               </w:rPr>
               <w:t>In cmd, run 'copy target\student-task-manager.war C:\Tomcat\webapps\' and capture output.</w:t>
+              <w:br/>
+            </w:r>
+            <w:r>
+              <w:rPr>
+                <w:rFonts w:ascii="Segoe UI" w:hAnsi="Segoe UI"/>
+                <w:i/>
+                <w:color w:val="64748B"/>
+                <w:sz w:val="17"/>
+              </w:rPr>
+              <w:t>📋 Paste karne ke liye: Win + Shift + S dabakar snip karein -&gt; Word mein yahan click karke Ctrl + V dabayein</w:t>
             </w:r>
           </w:p>
         </w:tc>
@@ -2858,7 +2732,7 @@
     </w:tbl>
     <w:p>
       <w:pPr>
-        <w:spacing w:after="120"/>
+        <w:spacing w:after="160"/>
       </w:pPr>
     </w:p>
     <w:p>
@@ -2936,61 +2810,6 @@
         <w:spacing w:after="80"/>
       </w:pPr>
     </w:p>
-    <w:p>
-      <w:pPr>
-        <w:spacing w:before="120" w:after="80"/>
-        <w:jc w:val="center"/>
-      </w:pPr>
-      <w:r>
-        <w:drawing>
-          <wp:inline xmlns:a="http://schemas.openxmlformats.org/drawingml/2006/main" xmlns:pic="http://schemas.openxmlformats.org/drawingml/2006/picture">
-            <wp:extent cx="5669280" cy="2746451"/>
-            <wp:docPr id="15" name="Picture 15"/>
-            <wp:cNvGraphicFramePr>
-              <a:graphicFrameLocks noChangeAspect="1"/>
-            </wp:cNvGraphicFramePr>
-            <a:graphic>
-              <a:graphicData uri="http://schemas.openxmlformats.org/drawingml/2006/picture">
-                <pic:pic>
-                  <pic:nvPicPr>
-                    <pic:cNvPr id="0" name="screenshot_5_2_tomcat_run.png"/>
-                    <pic:cNvPicPr/>
-                  </pic:nvPicPr>
-                  <pic:blipFill>
-                    <a:blip r:embed="rId23"/>
-                    <a:stretch>
-                      <a:fillRect/>
-                    </a:stretch>
-                  </pic:blipFill>
-                  <pic:spPr>
-                    <a:xfrm>
-                      <a:off x="0" y="0"/>
-                      <a:ext cx="5669280" cy="2746451"/>
-                    </a:xfrm>
-                    <a:prstGeom prst="rect"/>
-                  </pic:spPr>
-                </pic:pic>
-              </a:graphicData>
-            </a:graphic>
-          </wp:inline>
-        </w:drawing>
-      </w:r>
-    </w:p>
-    <w:p>
-      <w:pPr>
-        <w:spacing w:before="40" w:after="120"/>
-        <w:jc w:val="center"/>
-      </w:pPr>
-      <w:r>
-        <w:rPr>
-          <w:rFonts w:ascii="Segoe UI" w:hAnsi="Segoe UI"/>
-          <w:i/>
-          <w:color w:val="6B7280"/>
-          <w:sz w:val="18"/>
-        </w:rPr>
-        <w:t>Figure: Figure 5.2 — Tomcat Startup Console confirming deployment of student-task-manager.war</w:t>
-      </w:r>
-    </w:p>
     <w:tbl>
       <w:tblPr>
         <w:tblW w:type="auto" w:w="0"/>
@@ -3004,32 +2823,78 @@
         <w:tc>
           <w:tcPr>
             <w:tcW w:type="dxa" w:w="9648"/>
-            <w:shd w:fill="F9FAFB"/>
+            <w:shd w:fill="F8FAFC"/>
             <w:tcMar>
-              <w:top w:w="100" w:type="dxa"/>
-              <w:bottom w:w="100" w:type="dxa"/>
-              <w:left w:w="150" w:type="dxa"/>
-              <w:right w:w="150" w:type="dxa"/>
+              <w:top w:w="140" w:type="dxa"/>
+              <w:bottom w:w="140" w:type="dxa"/>
+              <w:left w:w="180" w:type="dxa"/>
+              <w:right w:w="180" w:type="dxa"/>
             </w:tcMar>
+            <w:tcBorders>
+              <w:top w:val="dashed" w:sz="16" w:space="0" w:color="94A3B8"/>
+              <w:left w:val="dashed" w:sz="16" w:space="0" w:color="94A3B8"/>
+              <w:bottom w:val="dashed" w:sz="16" w:space="0" w:color="94A3B8"/>
+              <w:right w:val="dashed" w:sz="16" w:space="0" w:color="94A3B8"/>
+            </w:tcBorders>
           </w:tcPr>
           <w:p>
             <w:pPr>
-              <w:spacing w:before="40" w:after="40"/>
+              <w:spacing w:before="120" w:after="40"/>
+              <w:jc w:val="center"/>
             </w:pPr>
             <w:r>
               <w:rPr>
+                <w:rFonts w:ascii="Segoe UI" w:hAnsi="Segoe UI"/>
                 <w:b/>
-                <w:color w:val="10B981"/>
-                <w:sz w:val="18"/>
+                <w:color w:val="1E3A8A"/>
+                <w:sz w:val="22"/>
               </w:rPr>
-              <w:t xml:space="preserve">📸 How to take this screenshot yourself: </w:t>
+              <w:t>📸 [SCREENSHOT PLACEHOLDER]</w:t>
+              <w:br/>
             </w:r>
             <w:r>
               <w:rPr>
+                <w:rFonts w:ascii="Segoe UI" w:hAnsi="Segoe UI"/>
+                <w:b/>
+                <w:color w:val="475569"/>
+                <w:sz w:val="19"/>
+              </w:rPr>
+              <w:t>Figure: Figure 5.2 — Tomcat Startup Console confirming deployment of student-task-manager.war</w:t>
+              <w:br/>
+            </w:r>
+          </w:p>
+          <w:p>
+            <w:pPr>
+              <w:spacing w:before="80" w:after="80"/>
+              <w:jc w:val="left"/>
+            </w:pPr>
+            <w:r>
+              <w:rPr>
+                <w:rFonts w:ascii="Segoe UI" w:hAnsi="Segoe UI"/>
+                <w:b/>
+                <w:color w:val="0D9488"/>
+                <w:sz w:val="18"/>
+              </w:rPr>
+              <w:t>👉 Asli Screenshot Lene Ka Tareeqa:</w:t>
+              <w:br/>
+            </w:r>
+            <w:r>
+              <w:rPr>
+                <w:rFonts w:ascii="Segoe UI" w:hAnsi="Segoe UI"/>
                 <w:color w:val="1F2937"/>
                 <w:sz w:val="17"/>
               </w:rPr>
               <w:t>Launch catalina.bat run in cmd and capture the server initialization and WAR deployment lines.</w:t>
+              <w:br/>
+            </w:r>
+            <w:r>
+              <w:rPr>
+                <w:rFonts w:ascii="Segoe UI" w:hAnsi="Segoe UI"/>
+                <w:i/>
+                <w:color w:val="64748B"/>
+                <w:sz w:val="17"/>
+              </w:rPr>
+              <w:t>📋 Paste karne ke liye: Win + Shift + S dabakar snip karein -&gt; Word mein yahan click karke Ctrl + V dabayein</w:t>
             </w:r>
           </w:p>
         </w:tc>
@@ -3037,7 +2902,7 @@
     </w:tbl>
     <w:p>
       <w:pPr>
-        <w:spacing w:after="120"/>
+        <w:spacing w:after="160"/>
       </w:pPr>
     </w:p>
     <w:p>
@@ -3057,61 +2922,6 @@
         <w:t>Navigating to http://localhost:8080/student-task-manager/ loads the deployed application. The browser renders the modern responsive UI with student task cards, priority indicators, and add-task controls.</w:t>
       </w:r>
     </w:p>
-    <w:p>
-      <w:pPr>
-        <w:spacing w:before="120" w:after="80"/>
-        <w:jc w:val="center"/>
-      </w:pPr>
-      <w:r>
-        <w:drawing>
-          <wp:inline xmlns:a="http://schemas.openxmlformats.org/drawingml/2006/main" xmlns:pic="http://schemas.openxmlformats.org/drawingml/2006/picture">
-            <wp:extent cx="5669280" cy="3818086"/>
-            <wp:docPr id="16" name="Picture 16"/>
-            <wp:cNvGraphicFramePr>
-              <a:graphicFrameLocks noChangeAspect="1"/>
-            </wp:cNvGraphicFramePr>
-            <a:graphic>
-              <a:graphicData uri="http://schemas.openxmlformats.org/drawingml/2006/picture">
-                <pic:pic>
-                  <pic:nvPicPr>
-                    <pic:cNvPr id="0" name="screenshot_5_3_browser_app.png"/>
-                    <pic:cNvPicPr/>
-                  </pic:nvPicPr>
-                  <pic:blipFill>
-                    <a:blip r:embed="rId24"/>
-                    <a:stretch>
-                      <a:fillRect/>
-                    </a:stretch>
-                  </pic:blipFill>
-                  <pic:spPr>
-                    <a:xfrm>
-                      <a:off x="0" y="0"/>
-                      <a:ext cx="5669280" cy="3818086"/>
-                    </a:xfrm>
-                    <a:prstGeom prst="rect"/>
-                  </pic:spPr>
-                </pic:pic>
-              </a:graphicData>
-            </a:graphic>
-          </wp:inline>
-        </w:drawing>
-      </w:r>
-    </w:p>
-    <w:p>
-      <w:pPr>
-        <w:spacing w:before="40" w:after="120"/>
-        <w:jc w:val="center"/>
-      </w:pPr>
-      <w:r>
-        <w:rPr>
-          <w:rFonts w:ascii="Segoe UI" w:hAnsi="Segoe UI"/>
-          <w:i/>
-          <w:color w:val="6B7280"/>
-          <w:sz w:val="18"/>
-        </w:rPr>
-        <w:t>Figure: Figure 5.3 — Student Task Management System Live on Apache Tomcat (Port 8080)</w:t>
-      </w:r>
-    </w:p>
     <w:tbl>
       <w:tblPr>
         <w:tblW w:type="auto" w:w="0"/>
@@ -3125,32 +2935,78 @@
         <w:tc>
           <w:tcPr>
             <w:tcW w:type="dxa" w:w="9648"/>
-            <w:shd w:fill="F9FAFB"/>
+            <w:shd w:fill="F8FAFC"/>
             <w:tcMar>
-              <w:top w:w="100" w:type="dxa"/>
-              <w:bottom w:w="100" w:type="dxa"/>
-              <w:left w:w="150" w:type="dxa"/>
-              <w:right w:w="150" w:type="dxa"/>
+              <w:top w:w="140" w:type="dxa"/>
+              <w:bottom w:w="140" w:type="dxa"/>
+              <w:left w:w="180" w:type="dxa"/>
+              <w:right w:w="180" w:type="dxa"/>
             </w:tcMar>
+            <w:tcBorders>
+              <w:top w:val="dashed" w:sz="16" w:space="0" w:color="94A3B8"/>
+              <w:left w:val="dashed" w:sz="16" w:space="0" w:color="94A3B8"/>
+              <w:bottom w:val="dashed" w:sz="16" w:space="0" w:color="94A3B8"/>
+              <w:right w:val="dashed" w:sz="16" w:space="0" w:color="94A3B8"/>
+            </w:tcBorders>
           </w:tcPr>
           <w:p>
             <w:pPr>
-              <w:spacing w:before="40" w:after="40"/>
+              <w:spacing w:before="120" w:after="40"/>
+              <w:jc w:val="center"/>
             </w:pPr>
             <w:r>
               <w:rPr>
+                <w:rFonts w:ascii="Segoe UI" w:hAnsi="Segoe UI"/>
                 <w:b/>
-                <w:color w:val="10B981"/>
-                <w:sz w:val="18"/>
+                <w:color w:val="1E3A8A"/>
+                <w:sz w:val="22"/>
               </w:rPr>
-              <w:t xml:space="preserve">📸 How to take this screenshot yourself: </w:t>
+              <w:t>📸 [SCREENSHOT PLACEHOLDER]</w:t>
+              <w:br/>
             </w:r>
             <w:r>
               <w:rPr>
+                <w:rFonts w:ascii="Segoe UI" w:hAnsi="Segoe UI"/>
+                <w:b/>
+                <w:color w:val="475569"/>
+                <w:sz w:val="19"/>
+              </w:rPr>
+              <w:t>Figure: Figure 5.3 — Student Task Management System Live on Apache Tomcat (Port 8080)</w:t>
+              <w:br/>
+            </w:r>
+          </w:p>
+          <w:p>
+            <w:pPr>
+              <w:spacing w:before="80" w:after="80"/>
+              <w:jc w:val="left"/>
+            </w:pPr>
+            <w:r>
+              <w:rPr>
+                <w:rFonts w:ascii="Segoe UI" w:hAnsi="Segoe UI"/>
+                <w:b/>
+                <w:color w:val="0D9488"/>
+                <w:sz w:val="18"/>
+              </w:rPr>
+              <w:t>👉 Asli Screenshot Lene Ka Tareeqa:</w:t>
+              <w:br/>
+            </w:r>
+            <w:r>
+              <w:rPr>
+                <w:rFonts w:ascii="Segoe UI" w:hAnsi="Segoe UI"/>
                 <w:color w:val="1F2937"/>
                 <w:sz w:val="17"/>
               </w:rPr>
               <w:t>Open Chrome/Edge, navigate to http://localhost:8080/student-task-manager/ and capture with Win + Shift + S.</w:t>
+              <w:br/>
+            </w:r>
+            <w:r>
+              <w:rPr>
+                <w:rFonts w:ascii="Segoe UI" w:hAnsi="Segoe UI"/>
+                <w:i/>
+                <w:color w:val="64748B"/>
+                <w:sz w:val="17"/>
+              </w:rPr>
+              <w:t>📋 Paste karne ke liye: Win + Shift + S dabakar snip karein -&gt; Word mein yahan click karke Ctrl + V dabayein</w:t>
             </w:r>
           </w:p>
         </w:tc>
@@ -3158,7 +3014,7 @@
     </w:tbl>
     <w:p>
       <w:pPr>
-        <w:spacing w:after="120"/>
+        <w:spacing w:after="160"/>
       </w:pPr>
     </w:p>
     <w:p>
@@ -3178,61 +3034,6 @@
         <w:t>Testing the interactive application by submitting a new task ('Deploy WAR to Apache Tomcat Server' with High priority) dynamically increases the live counter badge from 3 to 4, demonstrating complete functional integrity.</w:t>
       </w:r>
     </w:p>
-    <w:p>
-      <w:pPr>
-        <w:spacing w:before="120" w:after="80"/>
-        <w:jc w:val="center"/>
-      </w:pPr>
-      <w:r>
-        <w:drawing>
-          <wp:inline xmlns:a="http://schemas.openxmlformats.org/drawingml/2006/main" xmlns:pic="http://schemas.openxmlformats.org/drawingml/2006/picture">
-            <wp:extent cx="5669280" cy="3818086"/>
-            <wp:docPr id="17" name="Picture 17"/>
-            <wp:cNvGraphicFramePr>
-              <a:graphicFrameLocks noChangeAspect="1"/>
-            </wp:cNvGraphicFramePr>
-            <a:graphic>
-              <a:graphicData uri="http://schemas.openxmlformats.org/drawingml/2006/picture">
-                <pic:pic>
-                  <pic:nvPicPr>
-                    <pic:cNvPr id="0" name="screenshot_5_4_browser_task_added.png"/>
-                    <pic:cNvPicPr/>
-                  </pic:nvPicPr>
-                  <pic:blipFill>
-                    <a:blip r:embed="rId25"/>
-                    <a:stretch>
-                      <a:fillRect/>
-                    </a:stretch>
-                  </pic:blipFill>
-                  <pic:spPr>
-                    <a:xfrm>
-                      <a:off x="0" y="0"/>
-                      <a:ext cx="5669280" cy="3818086"/>
-                    </a:xfrm>
-                    <a:prstGeom prst="rect"/>
-                  </pic:spPr>
-                </pic:pic>
-              </a:graphicData>
-            </a:graphic>
-          </wp:inline>
-        </w:drawing>
-      </w:r>
-    </w:p>
-    <w:p>
-      <w:pPr>
-        <w:spacing w:before="40" w:after="120"/>
-        <w:jc w:val="center"/>
-      </w:pPr>
-      <w:r>
-        <w:rPr>
-          <w:rFonts w:ascii="Segoe UI" w:hAnsi="Segoe UI"/>
-          <w:i/>
-          <w:color w:val="6B7280"/>
-          <w:sz w:val="18"/>
-        </w:rPr>
-        <w:t>Figure: Figure 5.4 — Dynamic Task Creation and Real-time Badge Increment in Web Browser</w:t>
-      </w:r>
-    </w:p>
     <w:tbl>
       <w:tblPr>
         <w:tblW w:type="auto" w:w="0"/>
@@ -3246,32 +3047,78 @@
         <w:tc>
           <w:tcPr>
             <w:tcW w:type="dxa" w:w="9648"/>
-            <w:shd w:fill="F9FAFB"/>
+            <w:shd w:fill="F8FAFC"/>
             <w:tcMar>
-              <w:top w:w="100" w:type="dxa"/>
-              <w:bottom w:w="100" w:type="dxa"/>
-              <w:left w:w="150" w:type="dxa"/>
-              <w:right w:w="150" w:type="dxa"/>
+              <w:top w:w="140" w:type="dxa"/>
+              <w:bottom w:w="140" w:type="dxa"/>
+              <w:left w:w="180" w:type="dxa"/>
+              <w:right w:w="180" w:type="dxa"/>
             </w:tcMar>
+            <w:tcBorders>
+              <w:top w:val="dashed" w:sz="16" w:space="0" w:color="94A3B8"/>
+              <w:left w:val="dashed" w:sz="16" w:space="0" w:color="94A3B8"/>
+              <w:bottom w:val="dashed" w:sz="16" w:space="0" w:color="94A3B8"/>
+              <w:right w:val="dashed" w:sz="16" w:space="0" w:color="94A3B8"/>
+            </w:tcBorders>
           </w:tcPr>
           <w:p>
             <w:pPr>
-              <w:spacing w:before="40" w:after="40"/>
+              <w:spacing w:before="120" w:after="40"/>
+              <w:jc w:val="center"/>
             </w:pPr>
             <w:r>
               <w:rPr>
+                <w:rFonts w:ascii="Segoe UI" w:hAnsi="Segoe UI"/>
                 <w:b/>
-                <w:color w:val="10B981"/>
-                <w:sz w:val="18"/>
+                <w:color w:val="1E3A8A"/>
+                <w:sz w:val="22"/>
               </w:rPr>
-              <w:t xml:space="preserve">📸 How to take this screenshot yourself: </w:t>
+              <w:t>📸 [SCREENSHOT PLACEHOLDER]</w:t>
+              <w:br/>
             </w:r>
             <w:r>
               <w:rPr>
+                <w:rFonts w:ascii="Segoe UI" w:hAnsi="Segoe UI"/>
+                <w:b/>
+                <w:color w:val="475569"/>
+                <w:sz w:val="19"/>
+              </w:rPr>
+              <w:t>Figure: Figure 5.4 — Dynamic Task Creation and Real-time Badge Increment in Web Browser</w:t>
+              <w:br/>
+            </w:r>
+          </w:p>
+          <w:p>
+            <w:pPr>
+              <w:spacing w:before="80" w:after="80"/>
+              <w:jc w:val="left"/>
+            </w:pPr>
+            <w:r>
+              <w:rPr>
+                <w:rFonts w:ascii="Segoe UI" w:hAnsi="Segoe UI"/>
+                <w:b/>
+                <w:color w:val="0D9488"/>
+                <w:sz w:val="18"/>
+              </w:rPr>
+              <w:t>👉 Asli Screenshot Lene Ka Tareeqa:</w:t>
+              <w:br/>
+            </w:r>
+            <w:r>
+              <w:rPr>
+                <w:rFonts w:ascii="Segoe UI" w:hAnsi="Segoe UI"/>
                 <w:color w:val="1F2937"/>
                 <w:sz w:val="17"/>
               </w:rPr>
               <w:t>Add a new task on the webpage, submit the form, and capture the page showing the newly added task.</w:t>
+              <w:br/>
+            </w:r>
+            <w:r>
+              <w:rPr>
+                <w:rFonts w:ascii="Segoe UI" w:hAnsi="Segoe UI"/>
+                <w:i/>
+                <w:color w:val="64748B"/>
+                <w:sz w:val="17"/>
+              </w:rPr>
+              <w:t>📋 Paste karne ke liye: Win + Shift + S dabakar snip karein -&gt; Word mein yahan click karke Ctrl + V dabayein</w:t>
             </w:r>
           </w:p>
         </w:tc>
@@ -3279,7 +3126,7 @@
     </w:tbl>
     <w:p>
       <w:pPr>
-        <w:spacing w:after="120"/>
+        <w:spacing w:after="160"/>
       </w:pPr>
     </w:p>
     <w:p>

</xml_diff>